<commit_message>
update docs on Mon, Sep 28, 2026  10:46:39 AM
</commit_message>
<xml_diff>
--- a/Java/microservices.docx
+++ b/Java/microservices.docx
@@ -1,6 +1,6 @@
 
 <file path=word/document.xml><?xml version="1.0" encoding="utf-8"?>
-<w:document xmlns:wpc="http://schemas.microsoft.com/office/word/2010/wordprocessingCanvas" xmlns:cx="http://schemas.microsoft.com/office/drawing/2014/chartex" xmlns:cx1="http://schemas.microsoft.com/office/drawing/2015/9/8/chartex" xmlns:cx2="http://schemas.microsoft.com/office/drawing/2015/10/21/chartex" xmlns:cx3="http://schemas.microsoft.com/office/drawing/2016/5/9/chartex" xmlns:cx4="http://schemas.microsoft.com/office/drawing/2016/5/10/chartex" xmlns:cx5="http://schemas.microsoft.com/office/drawing/2016/5/11/chartex" xmlns:cx6="http://schemas.microsoft.com/office/drawing/2016/5/12/chartex" xmlns:cx7="http://schemas.microsoft.com/office/drawing/2016/5/13/chartex" xmlns:cx8="http://schemas.microsoft.com/office/drawing/2016/5/14/chartex" xmlns:mc="http://schemas.openxmlformats.org/markup-compatibility/2006" xmlns:aink="http://schemas.microsoft.com/office/drawing/2016/ink" xmlns:am3d="http://schemas.microsoft.com/office/drawing/2017/model3d" xmlns:o="urn:schemas-microsoft-com:office:office" xmlns:oel="http://schemas.microsoft.com/office/2019/extlst" xmlns:r="http://schemas.openxmlformats.org/officeDocument/2006/relationships" xmlns:m="http://schemas.openxmlformats.org/officeDocument/2006/math" xmlns:v="urn:schemas-microsoft-com:vml" xmlns:wp14="http://schemas.microsoft.com/office/word/2010/wordprocessingDrawing" xmlns:wp="http://schemas.openxmlformats.org/drawingml/2006/wordprocessingDrawing" xmlns:w10="urn:schemas-microsoft-com:office:word" xmlns:w="http://schemas.openxmlformats.org/wordprocessingml/2006/main" xmlns:w14="http://schemas.microsoft.com/office/word/2010/wordml" xmlns:w15="http://schemas.microsoft.com/office/word/2012/wordml" xmlns:w16cei="http://schemas.microsoft.com/office/word/2026/wordml/cei" xmlns:w16cex="http://schemas.microsoft.com/office/word/2018/wordml/cex" xmlns:w16cid="http://schemas.microsoft.com/office/word/2016/wordml/cid" xmlns:w16="http://schemas.microsoft.com/office/word/2018/wordml" xmlns:w16du="http://schemas.microsoft.com/office/word/2023/wordml/word16du" xmlns:w16sdtdh="http://schemas.microsoft.com/office/word/2020/wordml/sdtdatahash" xmlns:w16sdtfl="http://schemas.microsoft.com/office/word/2024/wordml/sdtformatlock" xmlns:w16se="http://schemas.microsoft.com/office/word/2015/wordml/symex" xmlns:wpg="http://schemas.microsoft.com/office/word/2010/wordprocessingGroup" xmlns:wpi="http://schemas.microsoft.com/office/word/2010/wordprocessingInk" xmlns:wne="http://schemas.microsoft.com/office/word/2006/wordml" xmlns:wps="http://schemas.microsoft.com/office/word/2010/wordprocessingShape" mc:Ignorable="w14 w15 w16se w16cid w16 w16cex w16sdtdh w16sdtfl w16du wp14">
+<w:document xmlns:wpc="http://schemas.microsoft.com/office/word/2010/wordprocessingCanvas" xmlns:cx="http://schemas.microsoft.com/office/drawing/2014/chartex" xmlns:cx1="http://schemas.microsoft.com/office/drawing/2015/9/8/chartex" xmlns:cx2="http://schemas.microsoft.com/office/drawing/2015/10/21/chartex" xmlns:cx3="http://schemas.microsoft.com/office/drawing/2016/5/9/chartex" xmlns:cx4="http://schemas.microsoft.com/office/drawing/2016/5/10/chartex" xmlns:cx5="http://schemas.microsoft.com/office/drawing/2016/5/11/chartex" xmlns:cx6="http://schemas.microsoft.com/office/drawing/2016/5/12/chartex" xmlns:cx7="http://schemas.microsoft.com/office/drawing/2016/5/13/chartex" xmlns:cx8="http://schemas.microsoft.com/office/drawing/2016/5/14/chartex" xmlns:mc="http://schemas.openxmlformats.org/markup-compatibility/2006" xmlns:aink="http://schemas.microsoft.com/office/drawing/2016/ink" xmlns:am3d="http://schemas.microsoft.com/office/drawing/2017/model3d" xmlns:o="urn:schemas-microsoft-com:office:office" xmlns:oel="http://schemas.microsoft.com/office/2019/extlst" xmlns:r="http://schemas.openxmlformats.org/officeDocument/2006/relationships" xmlns:m="http://schemas.openxmlformats.org/officeDocument/2006/math" xmlns:v="urn:schemas-microsoft-com:vml" xmlns:wp14="http://schemas.microsoft.com/office/word/2010/wordprocessingDrawing" xmlns:wp="http://schemas.openxmlformats.org/drawingml/2006/wordprocessingDrawing" xmlns:w10="urn:schemas-microsoft-com:office:word" xmlns:w="http://schemas.openxmlformats.org/wordprocessingml/2006/main" xmlns:w14="http://schemas.microsoft.com/office/word/2010/wordml" xmlns:w15="http://schemas.microsoft.com/office/word/2012/wordml" xmlns:w16cex="http://schemas.microsoft.com/office/word/2018/wordml/cex" xmlns:w16cid="http://schemas.microsoft.com/office/word/2016/wordml/cid" xmlns:w16="http://schemas.microsoft.com/office/word/2018/wordml" xmlns:w16du="http://schemas.microsoft.com/office/word/2023/wordml/word16du" xmlns:w16sdtdh="http://schemas.microsoft.com/office/word/2020/wordml/sdtdatahash" xmlns:w16sdtfl="http://schemas.microsoft.com/office/word/2024/wordml/sdtformatlock" xmlns:w16se="http://schemas.microsoft.com/office/word/2015/wordml/symex" xmlns:wpg="http://schemas.microsoft.com/office/word/2010/wordprocessingGroup" xmlns:wpi="http://schemas.microsoft.com/office/word/2010/wordprocessingInk" xmlns:wne="http://schemas.microsoft.com/office/word/2006/wordml" xmlns:wps="http://schemas.microsoft.com/office/word/2010/wordprocessingShape" mc:Ignorable="w14 w15 w16se w16cid w16 w16cex w16sdtdh w16sdtfl w16du wp14">
   <w:body>
     <w:p>
       <w:pPr>
@@ -258,7 +258,51 @@
           <w:lang w:val="en-US"/>
           <w14:ligatures w14:val="none"/>
         </w:rPr>
-        <w:t xml:space="preserve">Hard to scale ( you scale entire app ) </w:t>
+        <w:t xml:space="preserve">Hard to scale </w:t>
+      </w:r>
+      <w:proofErr w:type="gramStart"/>
+      <w:r>
+        <w:rPr>
+          <w:rFonts w:eastAsia="Times New Roman" w:cs="Times New Roman"/>
+          <w:kern w:val="0"/>
+          <w:szCs w:val="28"/>
+          <w:lang w:val="en-US"/>
+          <w14:ligatures w14:val="none"/>
+        </w:rPr>
+        <w:t>( you</w:t>
+      </w:r>
+      <w:proofErr w:type="gramEnd"/>
+      <w:r>
+        <w:rPr>
+          <w:rFonts w:eastAsia="Times New Roman" w:cs="Times New Roman"/>
+          <w:kern w:val="0"/>
+          <w:szCs w:val="28"/>
+          <w:lang w:val="en-US"/>
+          <w14:ligatures w14:val="none"/>
+        </w:rPr>
+        <w:t xml:space="preserve"> scale entire </w:t>
+      </w:r>
+      <w:proofErr w:type="gramStart"/>
+      <w:r>
+        <w:rPr>
+          <w:rFonts w:eastAsia="Times New Roman" w:cs="Times New Roman"/>
+          <w:kern w:val="0"/>
+          <w:szCs w:val="28"/>
+          <w:lang w:val="en-US"/>
+          <w14:ligatures w14:val="none"/>
+        </w:rPr>
+        <w:t>app )</w:t>
+      </w:r>
+      <w:proofErr w:type="gramEnd"/>
+      <w:r>
+        <w:rPr>
+          <w:rFonts w:eastAsia="Times New Roman" w:cs="Times New Roman"/>
+          <w:kern w:val="0"/>
+          <w:szCs w:val="28"/>
+          <w:lang w:val="en-US"/>
+          <w14:ligatures w14:val="none"/>
+        </w:rPr>
+        <w:t xml:space="preserve"> </w:t>
       </w:r>
     </w:p>
     <w:p>
@@ -637,15 +681,27 @@
           <w14:ligatures w14:val="none"/>
         </w:rPr>
       </w:pPr>
-      <w:r>
-        <w:rPr>
-          <w:rFonts w:eastAsia="Times New Roman" w:cs="Times New Roman"/>
-          <w:kern w:val="0"/>
-          <w:szCs w:val="28"/>
-          <w:lang w:val="en-US"/>
-          <w14:ligatures w14:val="none"/>
-        </w:rPr>
-        <w:t xml:space="preserve">Loose coupling </w:t>
+      <w:proofErr w:type="gramStart"/>
+      <w:r>
+        <w:rPr>
+          <w:rFonts w:eastAsia="Times New Roman" w:cs="Times New Roman"/>
+          <w:kern w:val="0"/>
+          <w:szCs w:val="28"/>
+          <w:lang w:val="en-US"/>
+          <w14:ligatures w14:val="none"/>
+        </w:rPr>
+        <w:t>Loose</w:t>
+      </w:r>
+      <w:proofErr w:type="gramEnd"/>
+      <w:r>
+        <w:rPr>
+          <w:rFonts w:eastAsia="Times New Roman" w:cs="Times New Roman"/>
+          <w:kern w:val="0"/>
+          <w:szCs w:val="28"/>
+          <w:lang w:val="en-US"/>
+          <w14:ligatures w14:val="none"/>
+        </w:rPr>
+        <w:t xml:space="preserve"> coupling </w:t>
       </w:r>
     </w:p>
     <w:p>
@@ -696,7 +752,51 @@
           <w:lang w:val="en-US"/>
           <w14:ligatures w14:val="none"/>
         </w:rPr>
-        <w:t xml:space="preserve">More complex ( network calls, failures ) </w:t>
+        <w:t xml:space="preserve">More complex </w:t>
+      </w:r>
+      <w:proofErr w:type="gramStart"/>
+      <w:r>
+        <w:rPr>
+          <w:rFonts w:eastAsia="Times New Roman" w:cs="Times New Roman"/>
+          <w:kern w:val="0"/>
+          <w:szCs w:val="28"/>
+          <w:lang w:val="en-US"/>
+          <w14:ligatures w14:val="none"/>
+        </w:rPr>
+        <w:t>( network</w:t>
+      </w:r>
+      <w:proofErr w:type="gramEnd"/>
+      <w:r>
+        <w:rPr>
+          <w:rFonts w:eastAsia="Times New Roman" w:cs="Times New Roman"/>
+          <w:kern w:val="0"/>
+          <w:szCs w:val="28"/>
+          <w:lang w:val="en-US"/>
+          <w14:ligatures w14:val="none"/>
+        </w:rPr>
+        <w:t xml:space="preserve"> calls, </w:t>
+      </w:r>
+      <w:proofErr w:type="gramStart"/>
+      <w:r>
+        <w:rPr>
+          <w:rFonts w:eastAsia="Times New Roman" w:cs="Times New Roman"/>
+          <w:kern w:val="0"/>
+          <w:szCs w:val="28"/>
+          <w:lang w:val="en-US"/>
+          <w14:ligatures w14:val="none"/>
+        </w:rPr>
+        <w:t>failures )</w:t>
+      </w:r>
+      <w:proofErr w:type="gramEnd"/>
+      <w:r>
+        <w:rPr>
+          <w:rFonts w:eastAsia="Times New Roman" w:cs="Times New Roman"/>
+          <w:kern w:val="0"/>
+          <w:szCs w:val="28"/>
+          <w:lang w:val="en-US"/>
+          <w14:ligatures w14:val="none"/>
+        </w:rPr>
+        <w:t xml:space="preserve"> </w:t>
       </w:r>
     </w:p>
     <w:p>
@@ -1319,7 +1419,18 @@
           <w:lang w:val="en-US"/>
           <w14:ligatures w14:val="none"/>
         </w:rPr>
-        <w:t xml:space="preserve">By using  </w:t>
+        <w:t xml:space="preserve">By </w:t>
+      </w:r>
+      <w:proofErr w:type="gramStart"/>
+      <w:r>
+        <w:rPr>
+          <w:rFonts w:eastAsia="Times New Roman" w:cs="Times New Roman"/>
+          <w:kern w:val="0"/>
+          <w:szCs w:val="28"/>
+          <w:lang w:val="en-US"/>
+          <w14:ligatures w14:val="none"/>
+        </w:rPr>
+        <w:t xml:space="preserve">using  </w:t>
       </w:r>
       <w:r>
         <w:rPr>
@@ -1331,17 +1442,54 @@
           <w:lang w:val="en-US"/>
           <w14:ligatures w14:val="none"/>
         </w:rPr>
-        <w:t xml:space="preserve">Eureka Client  </w:t>
-      </w:r>
-      <w:r>
-        <w:rPr>
-          <w:rFonts w:eastAsia="Times New Roman" w:cs="Times New Roman"/>
-          <w:kern w:val="0"/>
-          <w:szCs w:val="28"/>
-          <w:lang w:val="en-US"/>
-          <w14:ligatures w14:val="none"/>
-        </w:rPr>
-        <w:t>in spring boot</w:t>
+        <w:t>Eureka</w:t>
+      </w:r>
+      <w:proofErr w:type="gramEnd"/>
+      <w:r>
+        <w:rPr>
+          <w:rFonts w:eastAsia="Times New Roman" w:cs="Times New Roman"/>
+          <w:b/>
+          <w:bCs/>
+          <w:kern w:val="0"/>
+          <w:szCs w:val="28"/>
+          <w:lang w:val="en-US"/>
+          <w14:ligatures w14:val="none"/>
+        </w:rPr>
+        <w:t xml:space="preserve"> </w:t>
+      </w:r>
+      <w:proofErr w:type="gramStart"/>
+      <w:r>
+        <w:rPr>
+          <w:rFonts w:eastAsia="Times New Roman" w:cs="Times New Roman"/>
+          <w:b/>
+          <w:bCs/>
+          <w:kern w:val="0"/>
+          <w:szCs w:val="28"/>
+          <w:lang w:val="en-US"/>
+          <w14:ligatures w14:val="none"/>
+        </w:rPr>
+        <w:t xml:space="preserve">Client  </w:t>
+      </w:r>
+      <w:r>
+        <w:rPr>
+          <w:rFonts w:eastAsia="Times New Roman" w:cs="Times New Roman"/>
+          <w:kern w:val="0"/>
+          <w:szCs w:val="28"/>
+          <w:lang w:val="en-US"/>
+          <w14:ligatures w14:val="none"/>
+        </w:rPr>
+        <w:t>in</w:t>
+      </w:r>
+      <w:proofErr w:type="gramEnd"/>
+      <w:r>
+        <w:rPr>
+          <w:rFonts w:eastAsia="Times New Roman" w:cs="Times New Roman"/>
+          <w:kern w:val="0"/>
+          <w:szCs w:val="28"/>
+          <w:lang w:val="en-US"/>
+          <w14:ligatures w14:val="none"/>
+        </w:rPr>
+        <w:t xml:space="preserve"> spring boot</w:t>
       </w:r>
     </w:p>
     <w:p>
@@ -1579,7 +1727,29 @@
           <w:lang w:val="en-US"/>
           <w14:ligatures w14:val="none"/>
         </w:rPr>
-        <w:t>: If multiple instances of Service B exist, the client uses a load balancer (like Spring Cloud LoadBalancer) to pick one instance based on algorithms like Round Robin.</w:t>
+        <w:t xml:space="preserve">: If multiple instances of Service B exist, the client uses a load balancer (like Spring Cloud </w:t>
+      </w:r>
+      <w:proofErr w:type="spellStart"/>
+      <w:r>
+        <w:rPr>
+          <w:rFonts w:eastAsia="Times New Roman" w:cs="Times New Roman"/>
+          <w:kern w:val="0"/>
+          <w:szCs w:val="28"/>
+          <w:lang w:val="en-US"/>
+          <w14:ligatures w14:val="none"/>
+        </w:rPr>
+        <w:t>LoadBalancer</w:t>
+      </w:r>
+      <w:proofErr w:type="spellEnd"/>
+      <w:r>
+        <w:rPr>
+          <w:rFonts w:eastAsia="Times New Roman" w:cs="Times New Roman"/>
+          <w:kern w:val="0"/>
+          <w:szCs w:val="28"/>
+          <w:lang w:val="en-US"/>
+          <w14:ligatures w14:val="none"/>
+        </w:rPr>
+        <w:t>) to pick one instance based on algorithms like Round Robin.</w:t>
       </w:r>
     </w:p>
     <w:p/>
@@ -1664,7 +1834,33 @@
           <w:lang w:val="en-US"/>
           <w14:ligatures w14:val="none"/>
         </w:rPr>
-        <w:t>manage external configuration (properties/yaml files) for multiple microservices in one place</w:t>
+        <w:t>manage external configuration (properties/</w:t>
+      </w:r>
+      <w:proofErr w:type="spellStart"/>
+      <w:r>
+        <w:rPr>
+          <w:rFonts w:eastAsia="Times New Roman" w:cs="Times New Roman"/>
+          <w:b/>
+          <w:bCs/>
+          <w:kern w:val="0"/>
+          <w:szCs w:val="28"/>
+          <w:lang w:val="en-US"/>
+          <w14:ligatures w14:val="none"/>
+        </w:rPr>
+        <w:t>yaml</w:t>
+      </w:r>
+      <w:proofErr w:type="spellEnd"/>
+      <w:r>
+        <w:rPr>
+          <w:rFonts w:eastAsia="Times New Roman" w:cs="Times New Roman"/>
+          <w:b/>
+          <w:bCs/>
+          <w:kern w:val="0"/>
+          <w:szCs w:val="28"/>
+          <w:lang w:val="en-US"/>
+          <w14:ligatures w14:val="none"/>
+        </w:rPr>
+        <w:t xml:space="preserve"> files) for multiple microservices in one place</w:t>
       </w:r>
       <w:r>
         <w:rPr>
@@ -1880,7 +2076,29 @@
           <w:lang w:val="en-US"/>
           <w14:ligatures w14:val="none"/>
         </w:rPr>
-        <w:t xml:space="preserve">Environment-based configs (dev, qa, prod) </w:t>
+        <w:t xml:space="preserve">Environment-based configs (dev, </w:t>
+      </w:r>
+      <w:proofErr w:type="spellStart"/>
+      <w:r>
+        <w:rPr>
+          <w:rFonts w:eastAsia="Times New Roman" w:cs="Times New Roman"/>
+          <w:kern w:val="0"/>
+          <w:szCs w:val="28"/>
+          <w:lang w:val="en-US"/>
+          <w14:ligatures w14:val="none"/>
+        </w:rPr>
+        <w:t>qa</w:t>
+      </w:r>
+      <w:proofErr w:type="spellEnd"/>
+      <w:r>
+        <w:rPr>
+          <w:rFonts w:eastAsia="Times New Roman" w:cs="Times New Roman"/>
+          <w:kern w:val="0"/>
+          <w:szCs w:val="28"/>
+          <w:lang w:val="en-US"/>
+          <w14:ligatures w14:val="none"/>
+        </w:rPr>
+        <w:t xml:space="preserve">, prod) </w:t>
       </w:r>
     </w:p>
     <w:p>
@@ -2113,29 +2331,73 @@
           <w:lang w:val="en-US"/>
           <w14:ligatures w14:val="none"/>
         </w:rPr>
-        <w:t>v1 → /api/v1/orders</w:t>
-      </w:r>
-    </w:p>
-    <w:p>
-      <w:pPr>
-        <w:spacing w:after="0" w:line="240" w:lineRule="auto"/>
-        <w:rPr>
-          <w:rFonts w:eastAsia="Times New Roman" w:cs="Times New Roman"/>
-          <w:kern w:val="0"/>
-          <w:szCs w:val="28"/>
-          <w:lang w:val="en-US"/>
-          <w14:ligatures w14:val="none"/>
-        </w:rPr>
-      </w:pPr>
-      <w:r>
-        <w:rPr>
-          <w:rFonts w:eastAsia="Times New Roman" w:cs="Times New Roman"/>
-          <w:kern w:val="0"/>
-          <w:szCs w:val="28"/>
-          <w:lang w:val="en-US"/>
-          <w14:ligatures w14:val="none"/>
-        </w:rPr>
-        <w:t>v2 → /api/v2/orders</w:t>
+        <w:t>v1 → /</w:t>
+      </w:r>
+      <w:proofErr w:type="spellStart"/>
+      <w:r>
+        <w:rPr>
+          <w:rFonts w:eastAsia="Times New Roman" w:cs="Times New Roman"/>
+          <w:kern w:val="0"/>
+          <w:szCs w:val="28"/>
+          <w:lang w:val="en-US"/>
+          <w14:ligatures w14:val="none"/>
+        </w:rPr>
+        <w:t>api</w:t>
+      </w:r>
+      <w:proofErr w:type="spellEnd"/>
+      <w:r>
+        <w:rPr>
+          <w:rFonts w:eastAsia="Times New Roman" w:cs="Times New Roman"/>
+          <w:kern w:val="0"/>
+          <w:szCs w:val="28"/>
+          <w:lang w:val="en-US"/>
+          <w14:ligatures w14:val="none"/>
+        </w:rPr>
+        <w:t>/v1/orders</w:t>
+      </w:r>
+    </w:p>
+    <w:p>
+      <w:pPr>
+        <w:spacing w:after="0" w:line="240" w:lineRule="auto"/>
+        <w:rPr>
+          <w:rFonts w:eastAsia="Times New Roman" w:cs="Times New Roman"/>
+          <w:kern w:val="0"/>
+          <w:szCs w:val="28"/>
+          <w:lang w:val="en-US"/>
+          <w14:ligatures w14:val="none"/>
+        </w:rPr>
+      </w:pPr>
+      <w:r>
+        <w:rPr>
+          <w:rFonts w:eastAsia="Times New Roman" w:cs="Times New Roman"/>
+          <w:kern w:val="0"/>
+          <w:szCs w:val="28"/>
+          <w:lang w:val="en-US"/>
+          <w14:ligatures w14:val="none"/>
+        </w:rPr>
+        <w:t>v2 → /</w:t>
+      </w:r>
+      <w:proofErr w:type="spellStart"/>
+      <w:r>
+        <w:rPr>
+          <w:rFonts w:eastAsia="Times New Roman" w:cs="Times New Roman"/>
+          <w:kern w:val="0"/>
+          <w:szCs w:val="28"/>
+          <w:lang w:val="en-US"/>
+          <w14:ligatures w14:val="none"/>
+        </w:rPr>
+        <w:t>api</w:t>
+      </w:r>
+      <w:proofErr w:type="spellEnd"/>
+      <w:r>
+        <w:rPr>
+          <w:rFonts w:eastAsia="Times New Roman" w:cs="Times New Roman"/>
+          <w:kern w:val="0"/>
+          <w:szCs w:val="28"/>
+          <w:lang w:val="en-US"/>
+          <w14:ligatures w14:val="none"/>
+        </w:rPr>
+        <w:t>/v2/orders</w:t>
       </w:r>
     </w:p>
     <w:p>
@@ -2193,15 +2455,27 @@
           <w14:ligatures w14:val="none"/>
         </w:rPr>
       </w:pPr>
-      <w:r>
-        <w:rPr>
-          <w:rFonts w:eastAsia="Times New Roman" w:cs="Times New Roman"/>
-          <w:kern w:val="0"/>
-          <w:szCs w:val="28"/>
-          <w:lang w:val="en-US"/>
-          <w14:ligatures w14:val="none"/>
-        </w:rPr>
-        <w:t xml:space="preserve">So you support </w:t>
+      <w:proofErr w:type="gramStart"/>
+      <w:r>
+        <w:rPr>
+          <w:rFonts w:eastAsia="Times New Roman" w:cs="Times New Roman"/>
+          <w:kern w:val="0"/>
+          <w:szCs w:val="28"/>
+          <w:lang w:val="en-US"/>
+          <w14:ligatures w14:val="none"/>
+        </w:rPr>
+        <w:t>So</w:t>
+      </w:r>
+      <w:proofErr w:type="gramEnd"/>
+      <w:r>
+        <w:rPr>
+          <w:rFonts w:eastAsia="Times New Roman" w:cs="Times New Roman"/>
+          <w:kern w:val="0"/>
+          <w:szCs w:val="28"/>
+          <w:lang w:val="en-US"/>
+          <w14:ligatures w14:val="none"/>
+        </w:rPr>
+        <w:t xml:space="preserve"> you support </w:t>
       </w:r>
       <w:r>
         <w:rPr>
@@ -2668,6 +2942,7 @@
         </w:rPr>
         <w:t xml:space="preserve"> is a </w:t>
       </w:r>
+      <w:proofErr w:type="gramStart"/>
       <w:r>
         <w:rPr>
           <w:rFonts w:eastAsia="Times New Roman" w:cs="Times New Roman"/>
@@ -2678,17 +2953,52 @@
           <w:lang w:val="en-US"/>
           <w14:ligatures w14:val="none"/>
         </w:rPr>
-        <w:t>single entry point</w:t>
-      </w:r>
-      <w:r>
-        <w:rPr>
-          <w:rFonts w:eastAsia="Times New Roman" w:cs="Times New Roman"/>
-          <w:kern w:val="0"/>
-          <w:szCs w:val="28"/>
-          <w:lang w:val="en-US"/>
-          <w14:ligatures w14:val="none"/>
-        </w:rPr>
-        <w:t xml:space="preserve"> for all client requests in a microservices architecture.</w:t>
+        <w:t>single entry</w:t>
+      </w:r>
+      <w:proofErr w:type="gramEnd"/>
+      <w:r>
+        <w:rPr>
+          <w:rFonts w:eastAsia="Times New Roman" w:cs="Times New Roman"/>
+          <w:b/>
+          <w:bCs/>
+          <w:kern w:val="0"/>
+          <w:szCs w:val="28"/>
+          <w:lang w:val="en-US"/>
+          <w14:ligatures w14:val="none"/>
+        </w:rPr>
+        <w:t xml:space="preserve"> point</w:t>
+      </w:r>
+      <w:r>
+        <w:rPr>
+          <w:rFonts w:eastAsia="Times New Roman" w:cs="Times New Roman"/>
+          <w:kern w:val="0"/>
+          <w:szCs w:val="28"/>
+          <w:lang w:val="en-US"/>
+          <w14:ligatures w14:val="none"/>
+        </w:rPr>
+        <w:t xml:space="preserve"> for all client requests in </w:t>
+      </w:r>
+      <w:proofErr w:type="gramStart"/>
+      <w:r>
+        <w:rPr>
+          <w:rFonts w:eastAsia="Times New Roman" w:cs="Times New Roman"/>
+          <w:kern w:val="0"/>
+          <w:szCs w:val="28"/>
+          <w:lang w:val="en-US"/>
+          <w14:ligatures w14:val="none"/>
+        </w:rPr>
+        <w:t>a microservices</w:t>
+      </w:r>
+      <w:proofErr w:type="gramEnd"/>
+      <w:r>
+        <w:rPr>
+          <w:rFonts w:eastAsia="Times New Roman" w:cs="Times New Roman"/>
+          <w:kern w:val="0"/>
+          <w:szCs w:val="28"/>
+          <w:lang w:val="en-US"/>
+          <w14:ligatures w14:val="none"/>
+        </w:rPr>
+        <w:t xml:space="preserve"> architecture.</w:t>
       </w:r>
     </w:p>
     <w:p>
@@ -3899,18 +4209,9 @@
           <w:lang w:val="en-US"/>
           <w14:ligatures w14:val="none"/>
         </w:rPr>
-        <w:t>Client decides which service instance to call</w:t>
-      </w:r>
-      <w:r>
-        <w:rPr>
-          <w:rFonts w:eastAsia="Times New Roman" w:cs="Times New Roman"/>
-          <w:kern w:val="0"/>
-          <w:szCs w:val="28"/>
-          <w:lang w:val="en-US"/>
-          <w14:ligatures w14:val="none"/>
-        </w:rPr>
-        <w:t xml:space="preserve">  </w:t>
-      </w:r>
+        <w:t xml:space="preserve">Client decides which </w:t>
+      </w:r>
+      <w:proofErr w:type="gramStart"/>
       <w:r>
         <w:rPr>
           <w:rFonts w:eastAsia="Times New Roman" w:cs="Times New Roman"/>
@@ -3921,7 +4222,68 @@
           <w:lang w:val="en-US"/>
           <w14:ligatures w14:val="none"/>
         </w:rPr>
-        <w:t>(Eureka LB)</w:t>
+        <w:t>service instance</w:t>
+      </w:r>
+      <w:proofErr w:type="gramEnd"/>
+      <w:r>
+        <w:rPr>
+          <w:rFonts w:eastAsia="Times New Roman" w:cs="Times New Roman"/>
+          <w:i/>
+          <w:iCs/>
+          <w:kern w:val="0"/>
+          <w:szCs w:val="28"/>
+          <w:lang w:val="en-US"/>
+          <w14:ligatures w14:val="none"/>
+        </w:rPr>
+        <w:t xml:space="preserve"> to </w:t>
+      </w:r>
+      <w:proofErr w:type="gramStart"/>
+      <w:r>
+        <w:rPr>
+          <w:rFonts w:eastAsia="Times New Roman" w:cs="Times New Roman"/>
+          <w:i/>
+          <w:iCs/>
+          <w:kern w:val="0"/>
+          <w:szCs w:val="28"/>
+          <w:lang w:val="en-US"/>
+          <w14:ligatures w14:val="none"/>
+        </w:rPr>
+        <w:t>call</w:t>
+      </w:r>
+      <w:r>
+        <w:rPr>
+          <w:rFonts w:eastAsia="Times New Roman" w:cs="Times New Roman"/>
+          <w:kern w:val="0"/>
+          <w:szCs w:val="28"/>
+          <w:lang w:val="en-US"/>
+          <w14:ligatures w14:val="none"/>
+        </w:rPr>
+        <w:t xml:space="preserve">  </w:t>
+      </w:r>
+      <w:r>
+        <w:rPr>
+          <w:rFonts w:eastAsia="Times New Roman" w:cs="Times New Roman"/>
+          <w:i/>
+          <w:iCs/>
+          <w:kern w:val="0"/>
+          <w:szCs w:val="28"/>
+          <w:lang w:val="en-US"/>
+          <w14:ligatures w14:val="none"/>
+        </w:rPr>
+        <w:t>(</w:t>
+      </w:r>
+      <w:proofErr w:type="gramEnd"/>
+      <w:r>
+        <w:rPr>
+          <w:rFonts w:eastAsia="Times New Roman" w:cs="Times New Roman"/>
+          <w:i/>
+          <w:iCs/>
+          <w:kern w:val="0"/>
+          <w:szCs w:val="28"/>
+          <w:lang w:val="en-US"/>
+          <w14:ligatures w14:val="none"/>
+        </w:rPr>
+        <w:t>Eureka LB)</w:t>
       </w:r>
     </w:p>
     <w:p>
@@ -5445,8 +5807,20 @@
           <w:lang w:val="en-US"/>
           <w14:ligatures w14:val="none"/>
         </w:rPr>
-        <w:t xml:space="preserve">: After a waiting period ( </w:t>
-      </w:r>
+        <w:t xml:space="preserve">: After a waiting period </w:t>
+      </w:r>
+      <w:proofErr w:type="gramStart"/>
+      <w:r>
+        <w:rPr>
+          <w:rFonts w:eastAsia="Times New Roman" w:cs="Times New Roman"/>
+          <w:kern w:val="0"/>
+          <w:szCs w:val="28"/>
+          <w:lang w:val="en-US"/>
+          <w14:ligatures w14:val="none"/>
+        </w:rPr>
+        <w:t xml:space="preserve">( </w:t>
+      </w:r>
+      <w:proofErr w:type="spellStart"/>
       <w:r>
         <w:rPr>
           <w:rFonts w:eastAsia="Times New Roman" w:cs="Times New Roman"/>
@@ -5459,15 +5833,61 @@
         </w:rPr>
         <w:t>waitDurationInOpenState</w:t>
       </w:r>
-      <w:r>
-        <w:rPr>
-          <w:rFonts w:eastAsia="Times New Roman" w:cs="Times New Roman"/>
-          <w:kern w:val="0"/>
-          <w:szCs w:val="28"/>
-          <w:lang w:val="en-US"/>
-          <w14:ligatures w14:val="none"/>
-        </w:rPr>
-        <w:t xml:space="preserve"> ) , the breaker allows a limited number of test requests. If they fail, it re-opens; if they succeed, it returns to the Closed state.</w:t>
+      <w:proofErr w:type="spellEnd"/>
+      <w:proofErr w:type="gramEnd"/>
+      <w:r>
+        <w:rPr>
+          <w:rFonts w:eastAsia="Times New Roman" w:cs="Times New Roman"/>
+          <w:kern w:val="0"/>
+          <w:szCs w:val="28"/>
+          <w:lang w:val="en-US"/>
+          <w14:ligatures w14:val="none"/>
+        </w:rPr>
+        <w:t xml:space="preserve"> </w:t>
+      </w:r>
+      <w:proofErr w:type="gramStart"/>
+      <w:r>
+        <w:rPr>
+          <w:rFonts w:eastAsia="Times New Roman" w:cs="Times New Roman"/>
+          <w:kern w:val="0"/>
+          <w:szCs w:val="28"/>
+          <w:lang w:val="en-US"/>
+          <w14:ligatures w14:val="none"/>
+        </w:rPr>
+        <w:t>) ,</w:t>
+      </w:r>
+      <w:proofErr w:type="gramEnd"/>
+      <w:r>
+        <w:rPr>
+          <w:rFonts w:eastAsia="Times New Roman" w:cs="Times New Roman"/>
+          <w:kern w:val="0"/>
+          <w:szCs w:val="28"/>
+          <w:lang w:val="en-US"/>
+          <w14:ligatures w14:val="none"/>
+        </w:rPr>
+        <w:t xml:space="preserve"> the breaker allows a limited number of test requests. If they fail, </w:t>
+      </w:r>
+      <w:proofErr w:type="gramStart"/>
+      <w:r>
+        <w:rPr>
+          <w:rFonts w:eastAsia="Times New Roman" w:cs="Times New Roman"/>
+          <w:kern w:val="0"/>
+          <w:szCs w:val="28"/>
+          <w:lang w:val="en-US"/>
+          <w14:ligatures w14:val="none"/>
+        </w:rPr>
+        <w:t>it</w:t>
+      </w:r>
+      <w:proofErr w:type="gramEnd"/>
+      <w:r>
+        <w:rPr>
+          <w:rFonts w:eastAsia="Times New Roman" w:cs="Times New Roman"/>
+          <w:kern w:val="0"/>
+          <w:szCs w:val="28"/>
+          <w:lang w:val="en-US"/>
+          <w14:ligatures w14:val="none"/>
+        </w:rPr>
+        <w:t xml:space="preserve"> re-opens; if they succeed, it returns to the Closed state.</w:t>
       </w:r>
     </w:p>
     <w:p>
@@ -7316,6 +7736,7 @@
                 <w14:ligatures w14:val="none"/>
               </w:rPr>
             </w:pPr>
+            <w:proofErr w:type="spellStart"/>
             <w:r>
               <w:rPr>
                 <w:rFonts w:eastAsia="Times New Roman" w:cs="Times New Roman"/>
@@ -7324,7 +7745,18 @@
                 <w:lang w:val="en-US"/>
                 <w14:ligatures w14:val="none"/>
               </w:rPr>
-              <w:t>Misconfig → block too early</w:t>
+              <w:t>Misconfig</w:t>
+            </w:r>
+            <w:proofErr w:type="spellEnd"/>
+            <w:r>
+              <w:rPr>
+                <w:rFonts w:eastAsia="Times New Roman" w:cs="Times New Roman"/>
+                <w:kern w:val="0"/>
+                <w:szCs w:val="28"/>
+                <w:lang w:val="en-US"/>
+                <w14:ligatures w14:val="none"/>
+              </w:rPr>
+              <w:t xml:space="preserve"> → block too early</w:t>
             </w:r>
           </w:p>
         </w:tc>
@@ -7386,7 +7818,29 @@
           <w:lang w:val="en-US"/>
           <w14:ligatures w14:val="none"/>
         </w:rPr>
-        <w:t>The Bulkhead pattern isolates different parts of a system so that a failure in one part does not bring down the entire system.</w:t>
+        <w:t xml:space="preserve">The Bulkhead pattern isolates different parts of a system so that </w:t>
+      </w:r>
+      <w:proofErr w:type="gramStart"/>
+      <w:r>
+        <w:rPr>
+          <w:rFonts w:eastAsia="Times New Roman" w:cs="Times New Roman"/>
+          <w:kern w:val="0"/>
+          <w:szCs w:val="28"/>
+          <w:lang w:val="en-US"/>
+          <w14:ligatures w14:val="none"/>
+        </w:rPr>
+        <w:t>a failure</w:t>
+      </w:r>
+      <w:proofErr w:type="gramEnd"/>
+      <w:r>
+        <w:rPr>
+          <w:rFonts w:eastAsia="Times New Roman" w:cs="Times New Roman"/>
+          <w:kern w:val="0"/>
+          <w:szCs w:val="28"/>
+          <w:lang w:val="en-US"/>
+          <w14:ligatures w14:val="none"/>
+        </w:rPr>
+        <w:t xml:space="preserve"> in one part does not bring down the entire system.</w:t>
       </w:r>
     </w:p>
     <w:p>
@@ -9096,7 +9550,29 @@
           <w14:ligatures w14:val="none"/>
         </w:rPr>
         <w:lastRenderedPageBreak/>
-        <w:t xml:space="preserve">There is a </w:t>
+        <w:t xml:space="preserve">There </w:t>
+      </w:r>
+      <w:proofErr w:type="gramStart"/>
+      <w:r>
+        <w:rPr>
+          <w:rFonts w:eastAsia="Times New Roman" w:cs="Times New Roman"/>
+          <w:kern w:val="0"/>
+          <w:szCs w:val="28"/>
+          <w:lang w:val="en-US"/>
+          <w14:ligatures w14:val="none"/>
+        </w:rPr>
+        <w:t>is</w:t>
+      </w:r>
+      <w:proofErr w:type="gramEnd"/>
+      <w:r>
+        <w:rPr>
+          <w:rFonts w:eastAsia="Times New Roman" w:cs="Times New Roman"/>
+          <w:kern w:val="0"/>
+          <w:szCs w:val="28"/>
+          <w:lang w:val="en-US"/>
+          <w14:ligatures w14:val="none"/>
+        </w:rPr>
+        <w:t xml:space="preserve"> a </w:t>
       </w:r>
       <w:r>
         <w:rPr>
@@ -9174,8 +9650,42 @@
           <w:lang w:val="en-US"/>
           <w14:ligatures w14:val="none"/>
         </w:rPr>
-        <w:t>Each service ( participant ) :</w:t>
-      </w:r>
+        <w:t xml:space="preserve">Each service </w:t>
+      </w:r>
+      <w:proofErr w:type="gramStart"/>
+      <w:r>
+        <w:rPr>
+          <w:rFonts w:eastAsia="Times New Roman" w:cs="Times New Roman"/>
+          <w:kern w:val="0"/>
+          <w:szCs w:val="28"/>
+          <w:lang w:val="en-US"/>
+          <w14:ligatures w14:val="none"/>
+        </w:rPr>
+        <w:t>( participant</w:t>
+      </w:r>
+      <w:proofErr w:type="gramEnd"/>
+      <w:r>
+        <w:rPr>
+          <w:rFonts w:eastAsia="Times New Roman" w:cs="Times New Roman"/>
+          <w:kern w:val="0"/>
+          <w:szCs w:val="28"/>
+          <w:lang w:val="en-US"/>
+          <w14:ligatures w14:val="none"/>
+        </w:rPr>
+        <w:t xml:space="preserve"> </w:t>
+      </w:r>
+      <w:proofErr w:type="gramStart"/>
+      <w:r>
+        <w:rPr>
+          <w:rFonts w:eastAsia="Times New Roman" w:cs="Times New Roman"/>
+          <w:kern w:val="0"/>
+          <w:szCs w:val="28"/>
+          <w:lang w:val="en-US"/>
+          <w14:ligatures w14:val="none"/>
+        </w:rPr>
+        <w:t>) :</w:t>
+      </w:r>
+      <w:proofErr w:type="gramEnd"/>
     </w:p>
     <w:p>
       <w:pPr>
@@ -9193,15 +9703,49 @@
           <w14:ligatures w14:val="none"/>
         </w:rPr>
       </w:pPr>
-      <w:r>
-        <w:rPr>
-          <w:rFonts w:eastAsia="Times New Roman" w:cs="Times New Roman"/>
-          <w:kern w:val="0"/>
-          <w:szCs w:val="28"/>
-          <w:lang w:val="en-US"/>
-          <w14:ligatures w14:val="none"/>
-        </w:rPr>
-        <w:t xml:space="preserve">Executes transaction </w:t>
+      <w:proofErr w:type="gramStart"/>
+      <w:r>
+        <w:rPr>
+          <w:rFonts w:eastAsia="Times New Roman" w:cs="Times New Roman"/>
+          <w:kern w:val="0"/>
+          <w:szCs w:val="28"/>
+          <w:lang w:val="en-US"/>
+          <w14:ligatures w14:val="none"/>
+        </w:rPr>
+        <w:t>Executes</w:t>
+      </w:r>
+      <w:proofErr w:type="gramEnd"/>
+      <w:r>
+        <w:rPr>
+          <w:rFonts w:eastAsia="Times New Roman" w:cs="Times New Roman"/>
+          <w:kern w:val="0"/>
+          <w:szCs w:val="28"/>
+          <w:lang w:val="en-US"/>
+          <w14:ligatures w14:val="none"/>
+        </w:rPr>
+        <w:t xml:space="preserve"> </w:t>
+      </w:r>
+      <w:proofErr w:type="gramStart"/>
+      <w:r>
+        <w:rPr>
+          <w:rFonts w:eastAsia="Times New Roman" w:cs="Times New Roman"/>
+          <w:kern w:val="0"/>
+          <w:szCs w:val="28"/>
+          <w:lang w:val="en-US"/>
+          <w14:ligatures w14:val="none"/>
+        </w:rPr>
+        <w:t>transaction</w:t>
+      </w:r>
+      <w:proofErr w:type="gramEnd"/>
+      <w:r>
+        <w:rPr>
+          <w:rFonts w:eastAsia="Times New Roman" w:cs="Times New Roman"/>
+          <w:kern w:val="0"/>
+          <w:szCs w:val="28"/>
+          <w:lang w:val="en-US"/>
+          <w14:ligatures w14:val="none"/>
+        </w:rPr>
+        <w:t xml:space="preserve"> </w:t>
       </w:r>
     </w:p>
     <w:p>
@@ -9948,8 +10492,20 @@
           <w:lang w:val="en-US"/>
           <w14:ligatures w14:val="none"/>
         </w:rPr>
-        <w:t>Single Point of Failure (Coordinator failure )</w:t>
-      </w:r>
+        <w:t xml:space="preserve">Single Point of Failure (Coordinator </w:t>
+      </w:r>
+      <w:proofErr w:type="gramStart"/>
+      <w:r>
+        <w:rPr>
+          <w:rFonts w:eastAsia="Times New Roman" w:cs="Times New Roman"/>
+          <w:kern w:val="0"/>
+          <w:szCs w:val="28"/>
+          <w:lang w:val="en-US"/>
+          <w14:ligatures w14:val="none"/>
+        </w:rPr>
+        <w:t>failure )</w:t>
+      </w:r>
+      <w:proofErr w:type="gramEnd"/>
     </w:p>
     <w:p>
       <w:pPr>
@@ -10788,15 +11344,27 @@
           <w14:ligatures w14:val="none"/>
         </w:rPr>
       </w:pPr>
-      <w:r>
-        <w:rPr>
-          <w:rFonts w:eastAsia="Times New Roman" w:cs="Times New Roman"/>
-          <w:kern w:val="0"/>
-          <w:szCs w:val="28"/>
-          <w:lang w:val="en-US"/>
-          <w14:ligatures w14:val="none"/>
-        </w:rPr>
-        <w:t xml:space="preserve">Eventual consistency </w:t>
+      <w:proofErr w:type="gramStart"/>
+      <w:r>
+        <w:rPr>
+          <w:rFonts w:eastAsia="Times New Roman" w:cs="Times New Roman"/>
+          <w:kern w:val="0"/>
+          <w:szCs w:val="28"/>
+          <w:lang w:val="en-US"/>
+          <w14:ligatures w14:val="none"/>
+        </w:rPr>
+        <w:t>Eventual</w:t>
+      </w:r>
+      <w:proofErr w:type="gramEnd"/>
+      <w:r>
+        <w:rPr>
+          <w:rFonts w:eastAsia="Times New Roman" w:cs="Times New Roman"/>
+          <w:kern w:val="0"/>
+          <w:szCs w:val="28"/>
+          <w:lang w:val="en-US"/>
+          <w14:ligatures w14:val="none"/>
+        </w:rPr>
+        <w:t xml:space="preserve"> consistency </w:t>
       </w:r>
     </w:p>
     <w:p>
@@ -10945,8 +11513,22 @@
           <w:lang w:val="en-US"/>
           <w14:ligatures w14:val="none"/>
         </w:rPr>
-        <w:t>Two Types of Saga</w:t>
-      </w:r>
+        <w:t xml:space="preserve">Two Types of </w:t>
+      </w:r>
+      <w:proofErr w:type="gramStart"/>
+      <w:r>
+        <w:rPr>
+          <w:rFonts w:eastAsia="Times New Roman" w:cs="Times New Roman"/>
+          <w:b/>
+          <w:bCs/>
+          <w:kern w:val="0"/>
+          <w:szCs w:val="28"/>
+          <w:lang w:val="en-US"/>
+          <w14:ligatures w14:val="none"/>
+        </w:rPr>
+        <w:t>Saga</w:t>
+      </w:r>
+      <w:proofErr w:type="gramEnd"/>
     </w:p>
     <w:p>
       <w:pPr>
@@ -11603,15 +12185,27 @@
           <w14:ligatures w14:val="none"/>
         </w:rPr>
       </w:pPr>
-      <w:r>
-        <w:rPr>
-          <w:rFonts w:eastAsia="Times New Roman" w:cs="Times New Roman"/>
-          <w:kern w:val="0"/>
-          <w:szCs w:val="28"/>
-          <w:lang w:val="en-US"/>
-          <w14:ligatures w14:val="none"/>
-        </w:rPr>
-        <w:t xml:space="preserve">Loose coupling </w:t>
+      <w:proofErr w:type="gramStart"/>
+      <w:r>
+        <w:rPr>
+          <w:rFonts w:eastAsia="Times New Roman" w:cs="Times New Roman"/>
+          <w:kern w:val="0"/>
+          <w:szCs w:val="28"/>
+          <w:lang w:val="en-US"/>
+          <w14:ligatures w14:val="none"/>
+        </w:rPr>
+        <w:t>Loose</w:t>
+      </w:r>
+      <w:proofErr w:type="gramEnd"/>
+      <w:r>
+        <w:rPr>
+          <w:rFonts w:eastAsia="Times New Roman" w:cs="Times New Roman"/>
+          <w:kern w:val="0"/>
+          <w:szCs w:val="28"/>
+          <w:lang w:val="en-US"/>
+          <w14:ligatures w14:val="none"/>
+        </w:rPr>
+        <w:t xml:space="preserve"> coupling </w:t>
       </w:r>
     </w:p>
     <w:p>
@@ -12024,7 +12618,29 @@
           <w:lang w:val="en-US"/>
           <w14:ligatures w14:val="none"/>
         </w:rPr>
-        <w:t xml:space="preserve"> → handles writes (create/update/delete) </w:t>
+        <w:t xml:space="preserve"> → handles </w:t>
+      </w:r>
+      <w:proofErr w:type="gramStart"/>
+      <w:r>
+        <w:rPr>
+          <w:rFonts w:eastAsia="Times New Roman" w:cs="Times New Roman"/>
+          <w:kern w:val="0"/>
+          <w:szCs w:val="28"/>
+          <w:lang w:val="en-US"/>
+          <w14:ligatures w14:val="none"/>
+        </w:rPr>
+        <w:t>writes</w:t>
+      </w:r>
+      <w:proofErr w:type="gramEnd"/>
+      <w:r>
+        <w:rPr>
+          <w:rFonts w:eastAsia="Times New Roman" w:cs="Times New Roman"/>
+          <w:kern w:val="0"/>
+          <w:szCs w:val="28"/>
+          <w:lang w:val="en-US"/>
+          <w14:ligatures w14:val="none"/>
+        </w:rPr>
+        <w:t xml:space="preserve"> (create/update/delete) </w:t>
       </w:r>
     </w:p>
     <w:p>
@@ -12063,8 +12679,20 @@
           <w:lang w:val="en-US"/>
           <w14:ligatures w14:val="none"/>
         </w:rPr>
-        <w:t xml:space="preserve"> → handles reads</w:t>
-      </w:r>
+        <w:t xml:space="preserve"> → handles </w:t>
+      </w:r>
+      <w:proofErr w:type="gramStart"/>
+      <w:r>
+        <w:rPr>
+          <w:rFonts w:eastAsia="Times New Roman" w:cs="Times New Roman"/>
+          <w:kern w:val="0"/>
+          <w:szCs w:val="28"/>
+          <w:lang w:val="en-US"/>
+          <w14:ligatures w14:val="none"/>
+        </w:rPr>
+        <w:t>reads</w:t>
+      </w:r>
+      <w:proofErr w:type="gramEnd"/>
     </w:p>
     <w:p>
       <w:pPr>
@@ -12307,62 +12935,9 @@
           <w:lang w:val="en-US"/>
           <w14:ligatures w14:val="none"/>
         </w:rPr>
-        <w:t>Use different classes/representations for writes and reads</w:t>
-      </w:r>
-      <w:r>
-        <w:rPr>
-          <w:rFonts w:eastAsia="Times New Roman" w:cs="Times New Roman"/>
-          <w:kern w:val="0"/>
-          <w:szCs w:val="28"/>
-          <w:lang w:val="en-US"/>
-          <w14:ligatures w14:val="none"/>
-        </w:rPr>
-        <w:t>, ( even if data is stored in the same DB ).</w:t>
-      </w:r>
-    </w:p>
-    <w:p>
-      <w:pPr>
-        <w:spacing w:after="0" w:line="240" w:lineRule="auto"/>
-        <w:rPr>
-          <w:rFonts w:eastAsia="Times New Roman" w:cs="Times New Roman"/>
-          <w:kern w:val="0"/>
-          <w:szCs w:val="28"/>
-          <w:lang w:val="en-US"/>
-          <w14:ligatures w14:val="none"/>
-        </w:rPr>
-      </w:pPr>
-      <w:r>
-        <w:rPr>
-          <w:rFonts w:eastAsia="Times New Roman" w:cs="Times New Roman"/>
-          <w:kern w:val="0"/>
-          <w:szCs w:val="28"/>
-          <w:lang w:val="en-US"/>
-          <w14:ligatures w14:val="none"/>
-        </w:rPr>
-        <w:t> </w:t>
-      </w:r>
-    </w:p>
-    <w:p>
-      <w:pPr>
-        <w:spacing w:after="0" w:line="240" w:lineRule="auto"/>
-        <w:rPr>
-          <w:rFonts w:eastAsia="Times New Roman" w:cs="Times New Roman"/>
-          <w:kern w:val="0"/>
-          <w:szCs w:val="28"/>
-          <w:lang w:val="en-US"/>
-          <w14:ligatures w14:val="none"/>
-        </w:rPr>
-      </w:pPr>
-      <w:r>
-        <w:rPr>
-          <w:rFonts w:eastAsia="Times New Roman" w:cs="Times New Roman"/>
-          <w:kern w:val="0"/>
-          <w:szCs w:val="28"/>
-          <w:lang w:val="en-US"/>
-          <w14:ligatures w14:val="none"/>
-        </w:rPr>
-        <w:t xml:space="preserve">It’s about </w:t>
-      </w:r>
+        <w:t xml:space="preserve">Use different classes/representations for </w:t>
+      </w:r>
+      <w:proofErr w:type="gramStart"/>
       <w:r>
         <w:rPr>
           <w:rFonts w:eastAsia="Times New Roman" w:cs="Times New Roman"/>
@@ -12373,6 +12948,143 @@
           <w:lang w:val="en-US"/>
           <w14:ligatures w14:val="none"/>
         </w:rPr>
+        <w:t>writes</w:t>
+      </w:r>
+      <w:proofErr w:type="gramEnd"/>
+      <w:r>
+        <w:rPr>
+          <w:rFonts w:eastAsia="Times New Roman" w:cs="Times New Roman"/>
+          <w:b/>
+          <w:bCs/>
+          <w:kern w:val="0"/>
+          <w:szCs w:val="28"/>
+          <w:lang w:val="en-US"/>
+          <w14:ligatures w14:val="none"/>
+        </w:rPr>
+        <w:t xml:space="preserve"> and </w:t>
+      </w:r>
+      <w:proofErr w:type="gramStart"/>
+      <w:r>
+        <w:rPr>
+          <w:rFonts w:eastAsia="Times New Roman" w:cs="Times New Roman"/>
+          <w:b/>
+          <w:bCs/>
+          <w:kern w:val="0"/>
+          <w:szCs w:val="28"/>
+          <w:lang w:val="en-US"/>
+          <w14:ligatures w14:val="none"/>
+        </w:rPr>
+        <w:t>reads</w:t>
+      </w:r>
+      <w:proofErr w:type="gramEnd"/>
+      <w:r>
+        <w:rPr>
+          <w:rFonts w:eastAsia="Times New Roman" w:cs="Times New Roman"/>
+          <w:kern w:val="0"/>
+          <w:szCs w:val="28"/>
+          <w:lang w:val="en-US"/>
+          <w14:ligatures w14:val="none"/>
+        </w:rPr>
+        <w:t xml:space="preserve">, </w:t>
+      </w:r>
+      <w:proofErr w:type="gramStart"/>
+      <w:r>
+        <w:rPr>
+          <w:rFonts w:eastAsia="Times New Roman" w:cs="Times New Roman"/>
+          <w:kern w:val="0"/>
+          <w:szCs w:val="28"/>
+          <w:lang w:val="en-US"/>
+          <w14:ligatures w14:val="none"/>
+        </w:rPr>
+        <w:t>( even</w:t>
+      </w:r>
+      <w:proofErr w:type="gramEnd"/>
+      <w:r>
+        <w:rPr>
+          <w:rFonts w:eastAsia="Times New Roman" w:cs="Times New Roman"/>
+          <w:kern w:val="0"/>
+          <w:szCs w:val="28"/>
+          <w:lang w:val="en-US"/>
+          <w14:ligatures w14:val="none"/>
+        </w:rPr>
+        <w:t xml:space="preserve"> if data is stored in the same </w:t>
+      </w:r>
+      <w:proofErr w:type="gramStart"/>
+      <w:r>
+        <w:rPr>
+          <w:rFonts w:eastAsia="Times New Roman" w:cs="Times New Roman"/>
+          <w:kern w:val="0"/>
+          <w:szCs w:val="28"/>
+          <w:lang w:val="en-US"/>
+          <w14:ligatures w14:val="none"/>
+        </w:rPr>
+        <w:t>DB )</w:t>
+      </w:r>
+      <w:proofErr w:type="gramEnd"/>
+      <w:r>
+        <w:rPr>
+          <w:rFonts w:eastAsia="Times New Roman" w:cs="Times New Roman"/>
+          <w:kern w:val="0"/>
+          <w:szCs w:val="28"/>
+          <w:lang w:val="en-US"/>
+          <w14:ligatures w14:val="none"/>
+        </w:rPr>
+        <w:t>.</w:t>
+      </w:r>
+    </w:p>
+    <w:p>
+      <w:pPr>
+        <w:spacing w:after="0" w:line="240" w:lineRule="auto"/>
+        <w:rPr>
+          <w:rFonts w:eastAsia="Times New Roman" w:cs="Times New Roman"/>
+          <w:kern w:val="0"/>
+          <w:szCs w:val="28"/>
+          <w:lang w:val="en-US"/>
+          <w14:ligatures w14:val="none"/>
+        </w:rPr>
+      </w:pPr>
+      <w:r>
+        <w:rPr>
+          <w:rFonts w:eastAsia="Times New Roman" w:cs="Times New Roman"/>
+          <w:kern w:val="0"/>
+          <w:szCs w:val="28"/>
+          <w:lang w:val="en-US"/>
+          <w14:ligatures w14:val="none"/>
+        </w:rPr>
+        <w:t> </w:t>
+      </w:r>
+    </w:p>
+    <w:p>
+      <w:pPr>
+        <w:spacing w:after="0" w:line="240" w:lineRule="auto"/>
+        <w:rPr>
+          <w:rFonts w:eastAsia="Times New Roman" w:cs="Times New Roman"/>
+          <w:kern w:val="0"/>
+          <w:szCs w:val="28"/>
+          <w:lang w:val="en-US"/>
+          <w14:ligatures w14:val="none"/>
+        </w:rPr>
+      </w:pPr>
+      <w:r>
+        <w:rPr>
+          <w:rFonts w:eastAsia="Times New Roman" w:cs="Times New Roman"/>
+          <w:kern w:val="0"/>
+          <w:szCs w:val="28"/>
+          <w:lang w:val="en-US"/>
+          <w14:ligatures w14:val="none"/>
+        </w:rPr>
+        <w:t xml:space="preserve">It’s about </w:t>
+      </w:r>
+      <w:r>
+        <w:rPr>
+          <w:rFonts w:eastAsia="Times New Roman" w:cs="Times New Roman"/>
+          <w:b/>
+          <w:bCs/>
+          <w:kern w:val="0"/>
+          <w:szCs w:val="28"/>
+          <w:lang w:val="en-US"/>
+          <w14:ligatures w14:val="none"/>
+        </w:rPr>
         <w:t>separating responsibility in code</w:t>
       </w:r>
       <w:r>
@@ -12529,15 +13241,27 @@
           <w14:ligatures w14:val="none"/>
         </w:rPr>
       </w:pPr>
-      <w:r>
-        <w:rPr>
-          <w:rFonts w:eastAsia="Times New Roman" w:cs="Times New Roman"/>
-          <w:kern w:val="0"/>
-          <w:szCs w:val="28"/>
-          <w:lang w:val="en-US"/>
-          <w14:ligatures w14:val="none"/>
-        </w:rPr>
-        <w:t>Read  → same DB (different query model)</w:t>
+      <w:proofErr w:type="gramStart"/>
+      <w:r>
+        <w:rPr>
+          <w:rFonts w:eastAsia="Times New Roman" w:cs="Times New Roman"/>
+          <w:kern w:val="0"/>
+          <w:szCs w:val="28"/>
+          <w:lang w:val="en-US"/>
+          <w14:ligatures w14:val="none"/>
+        </w:rPr>
+        <w:t>Read  →</w:t>
+      </w:r>
+      <w:proofErr w:type="gramEnd"/>
+      <w:r>
+        <w:rPr>
+          <w:rFonts w:eastAsia="Times New Roman" w:cs="Times New Roman"/>
+          <w:kern w:val="0"/>
+          <w:szCs w:val="28"/>
+          <w:lang w:val="en-US"/>
+          <w14:ligatures w14:val="none"/>
+        </w:rPr>
+        <w:t xml:space="preserve"> same DB (different query model)</w:t>
       </w:r>
     </w:p>
     <w:p>
@@ -12706,15 +13430,27 @@
           <w14:ligatures w14:val="none"/>
         </w:rPr>
       </w:pPr>
-      <w:r>
-        <w:rPr>
-          <w:rFonts w:eastAsia="Times New Roman" w:cs="Times New Roman"/>
-          <w:kern w:val="0"/>
-          <w:szCs w:val="28"/>
-          <w:lang w:val="en-US"/>
-          <w14:ligatures w14:val="none"/>
-        </w:rPr>
-        <w:t>Read  → Read DB</w:t>
+      <w:proofErr w:type="gramStart"/>
+      <w:r>
+        <w:rPr>
+          <w:rFonts w:eastAsia="Times New Roman" w:cs="Times New Roman"/>
+          <w:kern w:val="0"/>
+          <w:szCs w:val="28"/>
+          <w:lang w:val="en-US"/>
+          <w14:ligatures w14:val="none"/>
+        </w:rPr>
+        <w:t>Read  →</w:t>
+      </w:r>
+      <w:proofErr w:type="gramEnd"/>
+      <w:r>
+        <w:rPr>
+          <w:rFonts w:eastAsia="Times New Roman" w:cs="Times New Roman"/>
+          <w:kern w:val="0"/>
+          <w:szCs w:val="28"/>
+          <w:lang w:val="en-US"/>
+          <w14:ligatures w14:val="none"/>
+        </w:rPr>
+        <w:t xml:space="preserve"> Read DB</w:t>
       </w:r>
     </w:p>
     <w:p>
@@ -12892,6 +13628,7 @@
           <w14:ligatures w14:val="none"/>
         </w:rPr>
       </w:pPr>
+      <w:proofErr w:type="spellStart"/>
       <w:r>
         <w:rPr>
           <w:rFonts w:eastAsia="Times New Roman" w:cs="Times New Roman"/>
@@ -12902,6 +13639,7 @@
         </w:rPr>
         <w:t>order_items</w:t>
       </w:r>
+      <w:proofErr w:type="spellEnd"/>
     </w:p>
     <w:p>
       <w:pPr>
@@ -13093,6 +13831,7 @@
         </w:rPr>
         <w:br/>
       </w:r>
+      <w:proofErr w:type="gramStart"/>
       <w:r>
         <w:rPr>
           <w:rFonts w:eastAsia="Times New Roman" w:cs="Times New Roman"/>
@@ -13104,7 +13843,21 @@
           <w:lang w:val="en-US"/>
           <w14:ligatures w14:val="none"/>
         </w:rPr>
-        <w:t xml:space="preserve">public class </w:t>
+        <w:t>public class</w:t>
+      </w:r>
+      <w:proofErr w:type="gramEnd"/>
+      <w:r>
+        <w:rPr>
+          <w:rFonts w:eastAsia="Times New Roman" w:cs="Times New Roman"/>
+          <w:b/>
+          <w:bCs/>
+          <w:color w:val="008000"/>
+          <w:kern w:val="0"/>
+          <w:szCs w:val="28"/>
+          <w:lang w:val="en-US"/>
+          <w14:ligatures w14:val="none"/>
+        </w:rPr>
+        <w:t xml:space="preserve"> </w:t>
       </w:r>
       <w:r>
         <w:rPr>
@@ -13193,7 +13946,33 @@
           <w:lang w:val="en-US"/>
           <w14:ligatures w14:val="none"/>
         </w:rPr>
-        <w:t xml:space="preserve"> Long id</w:t>
+        <w:t xml:space="preserve"> </w:t>
+      </w:r>
+      <w:proofErr w:type="gramStart"/>
+      <w:r>
+        <w:rPr>
+          <w:rFonts w:eastAsia="Times New Roman" w:cs="Times New Roman"/>
+          <w:b/>
+          <w:bCs/>
+          <w:kern w:val="0"/>
+          <w:szCs w:val="28"/>
+          <w:lang w:val="en-US"/>
+          <w14:ligatures w14:val="none"/>
+        </w:rPr>
+        <w:t>Long</w:t>
+      </w:r>
+      <w:proofErr w:type="gramEnd"/>
+      <w:r>
+        <w:rPr>
+          <w:rFonts w:eastAsia="Times New Roman" w:cs="Times New Roman"/>
+          <w:b/>
+          <w:bCs/>
+          <w:kern w:val="0"/>
+          <w:szCs w:val="28"/>
+          <w:lang w:val="en-US"/>
+          <w14:ligatures w14:val="none"/>
+        </w:rPr>
+        <w:t xml:space="preserve"> id</w:t>
       </w:r>
       <w:r>
         <w:rPr>
@@ -13334,6 +14113,7 @@
         </w:rPr>
         <w:t>&lt;</w:t>
       </w:r>
+      <w:proofErr w:type="spellStart"/>
       <w:r>
         <w:rPr>
           <w:rFonts w:eastAsia="Times New Roman" w:cs="Times New Roman"/>
@@ -13346,6 +14126,7 @@
         </w:rPr>
         <w:t>OrderItem</w:t>
       </w:r>
+      <w:proofErr w:type="spellEnd"/>
       <w:r>
         <w:rPr>
           <w:rFonts w:eastAsia="Times New Roman" w:cs="Times New Roman"/>
@@ -13419,8 +14200,22 @@
           <w:lang w:val="en-US"/>
           <w14:ligatures w14:val="none"/>
         </w:rPr>
-        <w:t xml:space="preserve"> Long userId</w:t>
-      </w:r>
+        <w:t xml:space="preserve"> Long </w:t>
+      </w:r>
+      <w:proofErr w:type="spellStart"/>
+      <w:r>
+        <w:rPr>
+          <w:rFonts w:eastAsia="Times New Roman" w:cs="Times New Roman"/>
+          <w:b/>
+          <w:bCs/>
+          <w:kern w:val="0"/>
+          <w:szCs w:val="28"/>
+          <w:lang w:val="en-US"/>
+          <w14:ligatures w14:val="none"/>
+        </w:rPr>
+        <w:t>userId</w:t>
+      </w:r>
+      <w:proofErr w:type="spellEnd"/>
       <w:r>
         <w:rPr>
           <w:rFonts w:eastAsia="Times New Roman" w:cs="Times New Roman"/>
@@ -13527,15 +14322,27 @@
         </w:rPr>
         <w:t xml:space="preserve">Used for: </w:t>
       </w:r>
-      <w:r>
-        <w:rPr>
-          <w:rFonts w:eastAsia="Times New Roman" w:cs="Times New Roman"/>
-          <w:kern w:val="0"/>
-          <w:szCs w:val="28"/>
-          <w:lang w:val="en-US"/>
-          <w14:ligatures w14:val="none"/>
-        </w:rPr>
-        <w:t>orderRepository.save(order);</w:t>
+      <w:proofErr w:type="spellStart"/>
+      <w:r>
+        <w:rPr>
+          <w:rFonts w:eastAsia="Times New Roman" w:cs="Times New Roman"/>
+          <w:kern w:val="0"/>
+          <w:szCs w:val="28"/>
+          <w:lang w:val="en-US"/>
+          <w14:ligatures w14:val="none"/>
+        </w:rPr>
+        <w:t>orderRepository.save</w:t>
+      </w:r>
+      <w:proofErr w:type="spellEnd"/>
+      <w:r>
+        <w:rPr>
+          <w:rFonts w:eastAsia="Times New Roman" w:cs="Times New Roman"/>
+          <w:kern w:val="0"/>
+          <w:szCs w:val="28"/>
+          <w:lang w:val="en-US"/>
+          <w14:ligatures w14:val="none"/>
+        </w:rPr>
+        <w:t>(order);</w:t>
       </w:r>
     </w:p>
     <w:p>
@@ -13682,6 +14489,7 @@
         </w:rPr>
         <w:t xml:space="preserve">public class </w:t>
       </w:r>
+      <w:proofErr w:type="spellStart"/>
       <w:r>
         <w:rPr>
           <w:rFonts w:eastAsia="Times New Roman" w:cs="Times New Roman"/>
@@ -13693,7 +14501,21 @@
           <w:lang w:val="en-US"/>
           <w14:ligatures w14:val="none"/>
         </w:rPr>
-        <w:t xml:space="preserve">OrderSummary </w:t>
+        <w:t>OrderSummary</w:t>
+      </w:r>
+      <w:proofErr w:type="spellEnd"/>
+      <w:r>
+        <w:rPr>
+          <w:rFonts w:eastAsia="Times New Roman" w:cs="Times New Roman"/>
+          <w:b/>
+          <w:bCs/>
+          <w:color w:val="0000FF"/>
+          <w:kern w:val="0"/>
+          <w:szCs w:val="28"/>
+          <w:lang w:val="en-US"/>
+          <w14:ligatures w14:val="none"/>
+        </w:rPr>
+        <w:t xml:space="preserve"> </w:t>
       </w:r>
       <w:r>
         <w:rPr>
@@ -13739,8 +14561,20 @@
           <w:lang w:val="en-US"/>
           <w14:ligatures w14:val="none"/>
         </w:rPr>
-        <w:t xml:space="preserve"> Long orderId</w:t>
-      </w:r>
+        <w:t xml:space="preserve"> Long </w:t>
+      </w:r>
+      <w:proofErr w:type="spellStart"/>
+      <w:r>
+        <w:rPr>
+          <w:rFonts w:eastAsia="Times New Roman" w:cs="Times New Roman"/>
+          <w:kern w:val="0"/>
+          <w:szCs w:val="28"/>
+          <w:lang w:val="en-US"/>
+          <w14:ligatures w14:val="none"/>
+        </w:rPr>
+        <w:t>orderId</w:t>
+      </w:r>
+      <w:proofErr w:type="spellEnd"/>
       <w:r>
         <w:rPr>
           <w:rFonts w:eastAsia="Times New Roman" w:cs="Times New Roman"/>
@@ -13784,8 +14618,20 @@
           <w:lang w:val="en-US"/>
           <w14:ligatures w14:val="none"/>
         </w:rPr>
-        <w:t xml:space="preserve"> String userName</w:t>
-      </w:r>
+        <w:t xml:space="preserve"> String </w:t>
+      </w:r>
+      <w:proofErr w:type="spellStart"/>
+      <w:r>
+        <w:rPr>
+          <w:rFonts w:eastAsia="Times New Roman" w:cs="Times New Roman"/>
+          <w:kern w:val="0"/>
+          <w:szCs w:val="28"/>
+          <w:lang w:val="en-US"/>
+          <w14:ligatures w14:val="none"/>
+        </w:rPr>
+        <w:t>userName</w:t>
+      </w:r>
+      <w:proofErr w:type="spellEnd"/>
       <w:r>
         <w:rPr>
           <w:rFonts w:eastAsia="Times New Roman" w:cs="Times New Roman"/>
@@ -13840,8 +14686,20 @@
           <w:lang w:val="en-US"/>
           <w14:ligatures w14:val="none"/>
         </w:rPr>
-        <w:t xml:space="preserve"> totalItems</w:t>
-      </w:r>
+        <w:t xml:space="preserve"> </w:t>
+      </w:r>
+      <w:proofErr w:type="spellStart"/>
+      <w:r>
+        <w:rPr>
+          <w:rFonts w:eastAsia="Times New Roman" w:cs="Times New Roman"/>
+          <w:kern w:val="0"/>
+          <w:szCs w:val="28"/>
+          <w:lang w:val="en-US"/>
+          <w14:ligatures w14:val="none"/>
+        </w:rPr>
+        <w:t>totalItems</w:t>
+      </w:r>
+      <w:proofErr w:type="spellEnd"/>
       <w:r>
         <w:rPr>
           <w:rFonts w:eastAsia="Times New Roman" w:cs="Times New Roman"/>
@@ -13896,8 +14754,20 @@
           <w:lang w:val="en-US"/>
           <w14:ligatures w14:val="none"/>
         </w:rPr>
-        <w:t xml:space="preserve"> totalAmount</w:t>
-      </w:r>
+        <w:t xml:space="preserve"> </w:t>
+      </w:r>
+      <w:proofErr w:type="spellStart"/>
+      <w:r>
+        <w:rPr>
+          <w:rFonts w:eastAsia="Times New Roman" w:cs="Times New Roman"/>
+          <w:kern w:val="0"/>
+          <w:szCs w:val="28"/>
+          <w:lang w:val="en-US"/>
+          <w14:ligatures w14:val="none"/>
+        </w:rPr>
+        <w:t>totalAmount</w:t>
+      </w:r>
+      <w:proofErr w:type="spellEnd"/>
       <w:r>
         <w:rPr>
           <w:rFonts w:eastAsia="Times New Roman" w:cs="Times New Roman"/>
@@ -14040,7 +14910,19 @@
           <w:lang w:val="en-US"/>
           <w14:ligatures w14:val="none"/>
         </w:rPr>
-        <w:t>@Query</w:t>
+        <w:t>@</w:t>
+      </w:r>
+      <w:proofErr w:type="gramStart"/>
+      <w:r>
+        <w:rPr>
+          <w:rFonts w:eastAsia="Times New Roman" w:cs="Times New Roman"/>
+          <w:color w:val="AA22FF"/>
+          <w:kern w:val="0"/>
+          <w:szCs w:val="28"/>
+          <w:lang w:val="en-US"/>
+          <w14:ligatures w14:val="none"/>
+        </w:rPr>
+        <w:t>Query</w:t>
       </w:r>
       <w:r>
         <w:rPr>
@@ -14051,8 +14933,33 @@
           <w:lang w:val="en-US"/>
           <w14:ligatures w14:val="none"/>
         </w:rPr>
-        <w:t>( // Join query )</w:t>
-      </w:r>
+        <w:t>( /</w:t>
+      </w:r>
+      <w:proofErr w:type="gramEnd"/>
+      <w:r>
+        <w:rPr>
+          <w:rFonts w:eastAsia="Times New Roman" w:cs="Times New Roman"/>
+          <w:color w:val="666666"/>
+          <w:kern w:val="0"/>
+          <w:szCs w:val="28"/>
+          <w:lang w:val="en-US"/>
+          <w14:ligatures w14:val="none"/>
+        </w:rPr>
+        <w:t xml:space="preserve">/ Join </w:t>
+      </w:r>
+      <w:proofErr w:type="gramStart"/>
+      <w:r>
+        <w:rPr>
+          <w:rFonts w:eastAsia="Times New Roman" w:cs="Times New Roman"/>
+          <w:color w:val="666666"/>
+          <w:kern w:val="0"/>
+          <w:szCs w:val="28"/>
+          <w:lang w:val="en-US"/>
+          <w14:ligatures w14:val="none"/>
+        </w:rPr>
+        <w:t>query )</w:t>
+      </w:r>
+      <w:proofErr w:type="gramEnd"/>
       <w:r>
         <w:rPr>
           <w:rFonts w:eastAsia="Times New Roman" w:cs="Times New Roman"/>
@@ -14075,6 +14982,7 @@
         </w:rPr>
         <w:t>&lt;</w:t>
       </w:r>
+      <w:proofErr w:type="spellStart"/>
       <w:r>
         <w:rPr>
           <w:rFonts w:eastAsia="Times New Roman" w:cs="Times New Roman"/>
@@ -14085,6 +14993,7 @@
         </w:rPr>
         <w:t>OrderSummary</w:t>
       </w:r>
+      <w:proofErr w:type="spellEnd"/>
       <w:r>
         <w:rPr>
           <w:rFonts w:eastAsia="Times New Roman" w:cs="Times New Roman"/>
@@ -14096,6 +15005,8 @@
         </w:rPr>
         <w:t xml:space="preserve">&gt; </w:t>
       </w:r>
+      <w:proofErr w:type="spellStart"/>
+      <w:proofErr w:type="gramStart"/>
       <w:r>
         <w:rPr>
           <w:rFonts w:eastAsia="Times New Roman" w:cs="Times New Roman"/>
@@ -14107,6 +15018,7 @@
         </w:rPr>
         <w:t>findOrderSummaries</w:t>
       </w:r>
+      <w:proofErr w:type="spellEnd"/>
       <w:r>
         <w:rPr>
           <w:rFonts w:eastAsia="Times New Roman" w:cs="Times New Roman"/>
@@ -14116,7 +15028,19 @@
           <w:lang w:val="en-US"/>
           <w14:ligatures w14:val="none"/>
         </w:rPr>
-        <w:t>();</w:t>
+        <w:t>(</w:t>
+      </w:r>
+      <w:proofErr w:type="gramEnd"/>
+      <w:r>
+        <w:rPr>
+          <w:rFonts w:eastAsia="Times New Roman" w:cs="Times New Roman"/>
+          <w:color w:val="666666"/>
+          <w:kern w:val="0"/>
+          <w:szCs w:val="28"/>
+          <w:lang w:val="en-US"/>
+          <w14:ligatures w14:val="none"/>
+        </w:rPr>
+        <w:t>);</w:t>
       </w:r>
     </w:p>
     <w:p>
@@ -14385,7 +15309,23 @@
           <w:szCs w:val="28"/>
           <w:lang w:val="en-US"/>
         </w:rPr>
-        <w:t>uses Trace ID  for a request across services.</w:t>
+        <w:t xml:space="preserve">uses Trace </w:t>
+      </w:r>
+      <w:proofErr w:type="gramStart"/>
+      <w:r>
+        <w:rPr>
+          <w:szCs w:val="28"/>
+          <w:lang w:val="en-US"/>
+        </w:rPr>
+        <w:t>ID  for</w:t>
+      </w:r>
+      <w:proofErr w:type="gramEnd"/>
+      <w:r>
+        <w:rPr>
+          <w:szCs w:val="28"/>
+          <w:lang w:val="en-US"/>
+        </w:rPr>
+        <w:t xml:space="preserve"> a request across services.</w:t>
       </w:r>
     </w:p>
     <w:p>
@@ -14470,8 +15410,17 @@
           <w:szCs w:val="28"/>
           <w:lang w:val="en-US"/>
         </w:rPr>
-        <w:t>Why is it called "Cloud-Native" ?</w:t>
-      </w:r>
+        <w:t>Why is it called "Cloud-Native</w:t>
+      </w:r>
+      <w:proofErr w:type="gramStart"/>
+      <w:r>
+        <w:rPr>
+          <w:szCs w:val="28"/>
+          <w:lang w:val="en-US"/>
+        </w:rPr>
+        <w:t>" ?</w:t>
+      </w:r>
+      <w:proofErr w:type="gramEnd"/>
     </w:p>
     <w:p>
       <w:pPr>
@@ -14778,6 +15727,7 @@
           <w14:ligatures w14:val="none"/>
         </w:rPr>
       </w:pPr>
+      <w:proofErr w:type="gramStart"/>
       <w:r>
         <w:rPr>
           <w:rFonts w:eastAsia="Times New Roman" w:cs="Times New Roman"/>
@@ -14786,7 +15736,18 @@
           <w:lang w:val="en-US"/>
           <w14:ligatures w14:val="none"/>
         </w:rPr>
-        <w:t xml:space="preserve">A Kubernetes system is called a </w:t>
+        <w:t>A Kubernetes</w:t>
+      </w:r>
+      <w:proofErr w:type="gramEnd"/>
+      <w:r>
+        <w:rPr>
+          <w:rFonts w:eastAsia="Times New Roman" w:cs="Times New Roman"/>
+          <w:kern w:val="0"/>
+          <w:sz w:val="24"/>
+          <w:lang w:val="en-US"/>
+          <w14:ligatures w14:val="none"/>
+        </w:rPr>
+        <w:t xml:space="preserve"> system is called a </w:t>
       </w:r>
       <w:r>
         <w:rPr>
@@ -14861,8 +15822,48 @@
           <w:lang w:val="en-US"/>
           <w14:ligatures w14:val="none"/>
         </w:rPr>
-        <w:t>Master Node ( Control Plane )</w:t>
-      </w:r>
+        <w:t xml:space="preserve">Master Node </w:t>
+      </w:r>
+      <w:proofErr w:type="gramStart"/>
+      <w:r>
+        <w:rPr>
+          <w:rFonts w:eastAsia="Times New Roman" w:cs="Times New Roman"/>
+          <w:b/>
+          <w:bCs/>
+          <w:kern w:val="0"/>
+          <w:sz w:val="24"/>
+          <w:lang w:val="en-US"/>
+          <w14:ligatures w14:val="none"/>
+        </w:rPr>
+        <w:t>( Control</w:t>
+      </w:r>
+      <w:proofErr w:type="gramEnd"/>
+      <w:r>
+        <w:rPr>
+          <w:rFonts w:eastAsia="Times New Roman" w:cs="Times New Roman"/>
+          <w:b/>
+          <w:bCs/>
+          <w:kern w:val="0"/>
+          <w:sz w:val="24"/>
+          <w:lang w:val="en-US"/>
+          <w14:ligatures w14:val="none"/>
+        </w:rPr>
+        <w:t xml:space="preserve"> </w:t>
+      </w:r>
+      <w:proofErr w:type="gramStart"/>
+      <w:r>
+        <w:rPr>
+          <w:rFonts w:eastAsia="Times New Roman" w:cs="Times New Roman"/>
+          <w:b/>
+          <w:bCs/>
+          <w:kern w:val="0"/>
+          <w:sz w:val="24"/>
+          <w:lang w:val="en-US"/>
+          <w14:ligatures w14:val="none"/>
+        </w:rPr>
+        <w:t>Plane )</w:t>
+      </w:r>
+      <w:proofErr w:type="gramEnd"/>
       <w:r>
         <w:rPr>
           <w:rFonts w:eastAsia="Times New Roman" w:cs="Times New Roman"/>
@@ -15324,6 +16325,7 @@
           <w14:ligatures w14:val="none"/>
         </w:rPr>
       </w:pPr>
+      <w:proofErr w:type="gramStart"/>
       <w:r>
         <w:rPr>
           <w:rFonts w:eastAsia="Times New Roman" w:cs="Times New Roman"/>
@@ -15346,6 +16348,7 @@
         </w:rPr>
         <w:t>Container</w:t>
       </w:r>
+      <w:proofErr w:type="gramEnd"/>
       <w:r>
         <w:rPr>
           <w:rFonts w:eastAsia="Times New Roman" w:cs="Times New Roman"/>
@@ -15938,12 +16941,10 @@
           <w:lang w:val="en-US"/>
           <w14:ligatures w14:val="none"/>
         </w:rPr>
-        <w:t>Requests: The minimum amount of resources the container guaranteed needs to start running.</w:t>
-      </w:r>
-    </w:p>
-    <w:p>
-      <w:pPr>
-        <w:spacing w:after="0" w:line="240" w:lineRule="auto"/>
+        <w:t xml:space="preserve">Requests: The minimum </w:t>
+      </w:r>
+      <w:proofErr w:type="gramStart"/>
+      <w:r>
         <w:rPr>
           <w:rFonts w:eastAsia="Times New Roman" w:cs="Times New Roman"/>
           <w:kern w:val="0"/>
@@ -15951,7 +16952,9 @@
           <w:lang w:val="en-US"/>
           <w14:ligatures w14:val="none"/>
         </w:rPr>
-      </w:pPr>
+        <w:t>amount</w:t>
+      </w:r>
+      <w:proofErr w:type="gramEnd"/>
       <w:r>
         <w:rPr>
           <w:rFonts w:eastAsia="Times New Roman" w:cs="Times New Roman"/>
@@ -15960,7 +16963,7 @@
           <w:lang w:val="en-US"/>
           <w14:ligatures w14:val="none"/>
         </w:rPr>
-        <w:t>Limits: The maximum amount of resources the container is allowed to consume.</w:t>
+        <w:t xml:space="preserve"> of resources the container guaranteed needs to start running.</w:t>
       </w:r>
     </w:p>
     <w:p>
@@ -15982,6 +16985,50 @@
           <w:lang w:val="en-US"/>
           <w14:ligatures w14:val="none"/>
         </w:rPr>
+        <w:t xml:space="preserve">Limits: The maximum </w:t>
+      </w:r>
+      <w:proofErr w:type="gramStart"/>
+      <w:r>
+        <w:rPr>
+          <w:rFonts w:eastAsia="Times New Roman" w:cs="Times New Roman"/>
+          <w:kern w:val="0"/>
+          <w:sz w:val="24"/>
+          <w:lang w:val="en-US"/>
+          <w14:ligatures w14:val="none"/>
+        </w:rPr>
+        <w:t>amount</w:t>
+      </w:r>
+      <w:proofErr w:type="gramEnd"/>
+      <w:r>
+        <w:rPr>
+          <w:rFonts w:eastAsia="Times New Roman" w:cs="Times New Roman"/>
+          <w:kern w:val="0"/>
+          <w:sz w:val="24"/>
+          <w:lang w:val="en-US"/>
+          <w14:ligatures w14:val="none"/>
+        </w:rPr>
+        <w:t xml:space="preserve"> of resources the container is allowed to consume.</w:t>
+      </w:r>
+    </w:p>
+    <w:p>
+      <w:pPr>
+        <w:spacing w:after="0" w:line="240" w:lineRule="auto"/>
+        <w:rPr>
+          <w:rFonts w:eastAsia="Times New Roman" w:cs="Times New Roman"/>
+          <w:kern w:val="0"/>
+          <w:sz w:val="24"/>
+          <w:lang w:val="en-US"/>
+          <w14:ligatures w14:val="none"/>
+        </w:rPr>
+      </w:pPr>
+      <w:r>
+        <w:rPr>
+          <w:rFonts w:eastAsia="Times New Roman" w:cs="Times New Roman"/>
+          <w:kern w:val="0"/>
+          <w:sz w:val="24"/>
+          <w:lang w:val="en-US"/>
+          <w14:ligatures w14:val="none"/>
+        </w:rPr>
         <w:t> </w:t>
       </w:r>
     </w:p>
@@ -15996,6 +17043,7 @@
           <w14:ligatures w14:val="none"/>
         </w:rPr>
       </w:pPr>
+      <w:proofErr w:type="gramStart"/>
       <w:r>
         <w:rPr>
           <w:rFonts w:eastAsia="Times New Roman" w:cs="Times New Roman"/>
@@ -16004,12 +17052,10 @@
           <w:lang w:val="en-US"/>
           <w14:ligatures w14:val="none"/>
         </w:rPr>
-        <w:t xml:space="preserve">Example : </w:t>
-      </w:r>
-    </w:p>
-    <w:p>
-      <w:pPr>
-        <w:spacing w:after="0" w:line="240" w:lineRule="auto"/>
+        <w:t>Example :</w:t>
+      </w:r>
+      <w:proofErr w:type="gramEnd"/>
+      <w:r>
         <w:rPr>
           <w:rFonts w:eastAsia="Times New Roman" w:cs="Times New Roman"/>
           <w:kern w:val="0"/>
@@ -16017,8 +17063,12 @@
           <w:lang w:val="en-US"/>
           <w14:ligatures w14:val="none"/>
         </w:rPr>
-      </w:pPr>
-      <w:r>
+        <w:t xml:space="preserve"> </w:t>
+      </w:r>
+    </w:p>
+    <w:p>
+      <w:pPr>
+        <w:spacing w:after="0" w:line="240" w:lineRule="auto"/>
         <w:rPr>
           <w:rFonts w:eastAsia="Times New Roman" w:cs="Times New Roman"/>
           <w:kern w:val="0"/>
@@ -16026,6 +17076,15 @@
           <w:lang w:val="en-US"/>
           <w14:ligatures w14:val="none"/>
         </w:rPr>
+      </w:pPr>
+      <w:r>
+        <w:rPr>
+          <w:rFonts w:eastAsia="Times New Roman" w:cs="Times New Roman"/>
+          <w:kern w:val="0"/>
+          <w:sz w:val="24"/>
+          <w:lang w:val="en-US"/>
+          <w14:ligatures w14:val="none"/>
+        </w:rPr>
         <w:t> </w:t>
       </w:r>
     </w:p>
@@ -16040,6 +17099,7 @@
           <w14:ligatures w14:val="none"/>
         </w:rPr>
       </w:pPr>
+      <w:proofErr w:type="spellStart"/>
       <w:r>
         <w:rPr>
           <w:rFonts w:eastAsia="Times New Roman" w:cs="Times New Roman"/>
@@ -16048,7 +17108,18 @@
           <w:lang w:val="en-US"/>
           <w14:ligatures w14:val="none"/>
         </w:rPr>
-        <w:t>apiVersion: v1</w:t>
+        <w:t>apiVersion</w:t>
+      </w:r>
+      <w:proofErr w:type="spellEnd"/>
+      <w:r>
+        <w:rPr>
+          <w:rFonts w:eastAsia="Times New Roman" w:cs="Times New Roman"/>
+          <w:kern w:val="0"/>
+          <w:sz w:val="24"/>
+          <w:lang w:val="en-US"/>
+          <w14:ligatures w14:val="none"/>
+        </w:rPr>
+        <w:t>: v1</w:t>
       </w:r>
     </w:p>
     <w:p>
@@ -16269,12 +17340,10 @@
           <w:lang w:val="en-US"/>
           <w14:ligatures w14:val="none"/>
         </w:rPr>
-        <w:t xml:space="preserve">        memory: "64Mi"   # Minimum memory required</w:t>
-      </w:r>
-    </w:p>
-    <w:p>
-      <w:pPr>
-        <w:spacing w:after="0" w:line="240" w:lineRule="auto"/>
+        <w:t xml:space="preserve">        memory: "64</w:t>
+      </w:r>
+      <w:proofErr w:type="gramStart"/>
+      <w:r>
         <w:rPr>
           <w:rFonts w:eastAsia="Times New Roman" w:cs="Times New Roman"/>
           <w:kern w:val="0"/>
@@ -16282,7 +17351,9 @@
           <w:lang w:val="en-US"/>
           <w14:ligatures w14:val="none"/>
         </w:rPr>
-      </w:pPr>
+        <w:t>Mi"   #</w:t>
+      </w:r>
+      <w:proofErr w:type="gramEnd"/>
       <w:r>
         <w:rPr>
           <w:rFonts w:eastAsia="Times New Roman" w:cs="Times New Roman"/>
@@ -16291,7 +17362,7 @@
           <w:lang w:val="en-US"/>
           <w14:ligatures w14:val="none"/>
         </w:rPr>
-        <w:t xml:space="preserve">        cpu: "250m"      # Minimum CPU required (0.25 of a core)</w:t>
+        <w:t xml:space="preserve"> Minimum memory required</w:t>
       </w:r>
     </w:p>
     <w:p>
@@ -16313,6 +17384,72 @@
           <w:lang w:val="en-US"/>
           <w14:ligatures w14:val="none"/>
         </w:rPr>
+        <w:t xml:space="preserve">        </w:t>
+      </w:r>
+      <w:proofErr w:type="spellStart"/>
+      <w:r>
+        <w:rPr>
+          <w:rFonts w:eastAsia="Times New Roman" w:cs="Times New Roman"/>
+          <w:kern w:val="0"/>
+          <w:sz w:val="24"/>
+          <w:lang w:val="en-US"/>
+          <w14:ligatures w14:val="none"/>
+        </w:rPr>
+        <w:t>cpu</w:t>
+      </w:r>
+      <w:proofErr w:type="spellEnd"/>
+      <w:r>
+        <w:rPr>
+          <w:rFonts w:eastAsia="Times New Roman" w:cs="Times New Roman"/>
+          <w:kern w:val="0"/>
+          <w:sz w:val="24"/>
+          <w:lang w:val="en-US"/>
+          <w14:ligatures w14:val="none"/>
+        </w:rPr>
+        <w:t>: "250</w:t>
+      </w:r>
+      <w:proofErr w:type="gramStart"/>
+      <w:r>
+        <w:rPr>
+          <w:rFonts w:eastAsia="Times New Roman" w:cs="Times New Roman"/>
+          <w:kern w:val="0"/>
+          <w:sz w:val="24"/>
+          <w:lang w:val="en-US"/>
+          <w14:ligatures w14:val="none"/>
+        </w:rPr>
+        <w:t>m"      #</w:t>
+      </w:r>
+      <w:proofErr w:type="gramEnd"/>
+      <w:r>
+        <w:rPr>
+          <w:rFonts w:eastAsia="Times New Roman" w:cs="Times New Roman"/>
+          <w:kern w:val="0"/>
+          <w:sz w:val="24"/>
+          <w:lang w:val="en-US"/>
+          <w14:ligatures w14:val="none"/>
+        </w:rPr>
+        <w:t xml:space="preserve"> Minimum CPU required (0.25 of a core)</w:t>
+      </w:r>
+    </w:p>
+    <w:p>
+      <w:pPr>
+        <w:spacing w:after="0" w:line="240" w:lineRule="auto"/>
+        <w:rPr>
+          <w:rFonts w:eastAsia="Times New Roman" w:cs="Times New Roman"/>
+          <w:kern w:val="0"/>
+          <w:sz w:val="24"/>
+          <w:lang w:val="en-US"/>
+          <w14:ligatures w14:val="none"/>
+        </w:rPr>
+      </w:pPr>
+      <w:r>
+        <w:rPr>
+          <w:rFonts w:eastAsia="Times New Roman" w:cs="Times New Roman"/>
+          <w:kern w:val="0"/>
+          <w:sz w:val="24"/>
+          <w:lang w:val="en-US"/>
+          <w14:ligatures w14:val="none"/>
+        </w:rPr>
         <w:t xml:space="preserve">      limits:</w:t>
       </w:r>
     </w:p>
@@ -16335,12 +17472,10 @@
           <w:lang w:val="en-US"/>
           <w14:ligatures w14:val="none"/>
         </w:rPr>
-        <w:t xml:space="preserve">        memory: "128Mi"  # Maximum memory allowed</w:t>
-      </w:r>
-    </w:p>
-    <w:p>
-      <w:pPr>
-        <w:spacing w:after="0" w:line="240" w:lineRule="auto"/>
+        <w:t xml:space="preserve">        memory: "128Mi</w:t>
+      </w:r>
+      <w:proofErr w:type="gramStart"/>
+      <w:r>
         <w:rPr>
           <w:rFonts w:eastAsia="Times New Roman" w:cs="Times New Roman"/>
           <w:kern w:val="0"/>
@@ -16348,7 +17483,9 @@
           <w:lang w:val="en-US"/>
           <w14:ligatures w14:val="none"/>
         </w:rPr>
-      </w:pPr>
+        <w:t>"  #</w:t>
+      </w:r>
+      <w:proofErr w:type="gramEnd"/>
       <w:r>
         <w:rPr>
           <w:rFonts w:eastAsia="Times New Roman" w:cs="Times New Roman"/>
@@ -16357,7 +17494,73 @@
           <w:lang w:val="en-US"/>
           <w14:ligatures w14:val="none"/>
         </w:rPr>
-        <w:t xml:space="preserve">        cpu: "500m"      # Maximum CPU allowed (0.5 of a core)</w:t>
+        <w:t xml:space="preserve"> Maximum memory allowed</w:t>
+      </w:r>
+    </w:p>
+    <w:p>
+      <w:pPr>
+        <w:spacing w:after="0" w:line="240" w:lineRule="auto"/>
+        <w:rPr>
+          <w:rFonts w:eastAsia="Times New Roman" w:cs="Times New Roman"/>
+          <w:kern w:val="0"/>
+          <w:sz w:val="24"/>
+          <w:lang w:val="en-US"/>
+          <w14:ligatures w14:val="none"/>
+        </w:rPr>
+      </w:pPr>
+      <w:r>
+        <w:rPr>
+          <w:rFonts w:eastAsia="Times New Roman" w:cs="Times New Roman"/>
+          <w:kern w:val="0"/>
+          <w:sz w:val="24"/>
+          <w:lang w:val="en-US"/>
+          <w14:ligatures w14:val="none"/>
+        </w:rPr>
+        <w:t xml:space="preserve">        </w:t>
+      </w:r>
+      <w:proofErr w:type="spellStart"/>
+      <w:r>
+        <w:rPr>
+          <w:rFonts w:eastAsia="Times New Roman" w:cs="Times New Roman"/>
+          <w:kern w:val="0"/>
+          <w:sz w:val="24"/>
+          <w:lang w:val="en-US"/>
+          <w14:ligatures w14:val="none"/>
+        </w:rPr>
+        <w:t>cpu</w:t>
+      </w:r>
+      <w:proofErr w:type="spellEnd"/>
+      <w:r>
+        <w:rPr>
+          <w:rFonts w:eastAsia="Times New Roman" w:cs="Times New Roman"/>
+          <w:kern w:val="0"/>
+          <w:sz w:val="24"/>
+          <w:lang w:val="en-US"/>
+          <w14:ligatures w14:val="none"/>
+        </w:rPr>
+        <w:t>: "500</w:t>
+      </w:r>
+      <w:proofErr w:type="gramStart"/>
+      <w:r>
+        <w:rPr>
+          <w:rFonts w:eastAsia="Times New Roman" w:cs="Times New Roman"/>
+          <w:kern w:val="0"/>
+          <w:sz w:val="24"/>
+          <w:lang w:val="en-US"/>
+          <w14:ligatures w14:val="none"/>
+        </w:rPr>
+        <w:t>m"      #</w:t>
+      </w:r>
+      <w:proofErr w:type="gramEnd"/>
+      <w:r>
+        <w:rPr>
+          <w:rFonts w:eastAsia="Times New Roman" w:cs="Times New Roman"/>
+          <w:kern w:val="0"/>
+          <w:sz w:val="24"/>
+          <w:lang w:val="en-US"/>
+          <w14:ligatures w14:val="none"/>
+        </w:rPr>
+        <w:t xml:space="preserve"> Maximum CPU allowed (0.5 of a core)</w:t>
       </w:r>
     </w:p>
     <w:p>
@@ -16593,6 +17796,7 @@
           <w:lang w:val="en-US"/>
         </w:rPr>
       </w:pPr>
+      <w:proofErr w:type="spellStart"/>
       <w:r>
         <w:rPr>
           <w:rFonts w:eastAsia="Times New Roman"/>
@@ -16600,6 +17804,7 @@
         </w:rPr>
         <w:t>ReplicaSet</w:t>
       </w:r>
+      <w:proofErr w:type="spellEnd"/>
     </w:p>
     <w:p>
       <w:pPr>
@@ -16644,6 +17849,7 @@
         </w:rPr>
         <w:t xml:space="preserve">A </w:t>
       </w:r>
+      <w:proofErr w:type="spellStart"/>
       <w:r>
         <w:rPr>
           <w:rFonts w:eastAsia="Times New Roman" w:cs="Times New Roman"/>
@@ -16656,6 +17862,7 @@
         </w:rPr>
         <w:t>ReplicaSet</w:t>
       </w:r>
+      <w:proofErr w:type="spellEnd"/>
       <w:r>
         <w:rPr>
           <w:rFonts w:eastAsia="Times New Roman" w:cs="Times New Roman"/>
@@ -16686,7 +17893,29 @@
           <w:lang w:val="en-US"/>
           <w14:ligatures w14:val="none"/>
         </w:rPr>
-        <w:t>Deployment internally manages ReplicaSets.</w:t>
+        <w:t xml:space="preserve">Deployment internally manages </w:t>
+      </w:r>
+      <w:proofErr w:type="spellStart"/>
+      <w:r>
+        <w:rPr>
+          <w:rFonts w:eastAsia="Times New Roman" w:cs="Times New Roman"/>
+          <w:kern w:val="0"/>
+          <w:sz w:val="24"/>
+          <w:lang w:val="en-US"/>
+          <w14:ligatures w14:val="none"/>
+        </w:rPr>
+        <w:t>ReplicaSets</w:t>
+      </w:r>
+      <w:proofErr w:type="spellEnd"/>
+      <w:r>
+        <w:rPr>
+          <w:rFonts w:eastAsia="Times New Roman" w:cs="Times New Roman"/>
+          <w:kern w:val="0"/>
+          <w:sz w:val="24"/>
+          <w:lang w:val="en-US"/>
+          <w14:ligatures w14:val="none"/>
+        </w:rPr>
+        <w:t>.</w:t>
       </w:r>
     </w:p>
     <w:p>
@@ -16930,12 +18159,10 @@
           <w:lang w:val="en-US"/>
           <w14:ligatures w14:val="none"/>
         </w:rPr>
-        <w:t>Instead of :  Call Pod IP directly</w:t>
-      </w:r>
-    </w:p>
-    <w:p>
-      <w:pPr>
-        <w:spacing w:after="0" w:line="240" w:lineRule="auto"/>
+        <w:t xml:space="preserve">Instead </w:t>
+      </w:r>
+      <w:proofErr w:type="gramStart"/>
+      <w:r>
         <w:rPr>
           <w:rFonts w:eastAsia="Times New Roman" w:cs="Times New Roman"/>
           <w:kern w:val="0"/>
@@ -16943,7 +18170,9 @@
           <w:lang w:val="en-US"/>
           <w14:ligatures w14:val="none"/>
         </w:rPr>
-      </w:pPr>
+        <w:t>of :</w:t>
+      </w:r>
+      <w:proofErr w:type="gramEnd"/>
       <w:r>
         <w:rPr>
           <w:rFonts w:eastAsia="Times New Roman" w:cs="Times New Roman"/>
@@ -16952,7 +18181,7 @@
           <w:lang w:val="en-US"/>
           <w14:ligatures w14:val="none"/>
         </w:rPr>
-        <w:t>Use : payment-service</w:t>
+        <w:t xml:space="preserve">  Call Pod IP directly</w:t>
       </w:r>
     </w:p>
     <w:p>
@@ -16966,6 +18195,7 @@
           <w14:ligatures w14:val="none"/>
         </w:rPr>
       </w:pPr>
+      <w:proofErr w:type="gramStart"/>
       <w:r>
         <w:rPr>
           <w:rFonts w:eastAsia="Times New Roman" w:cs="Times New Roman"/>
@@ -16974,6 +18204,51 @@
           <w:lang w:val="en-US"/>
           <w14:ligatures w14:val="none"/>
         </w:rPr>
+        <w:t>Use :</w:t>
+      </w:r>
+      <w:proofErr w:type="gramEnd"/>
+      <w:r>
+        <w:rPr>
+          <w:rFonts w:eastAsia="Times New Roman" w:cs="Times New Roman"/>
+          <w:kern w:val="0"/>
+          <w:sz w:val="24"/>
+          <w:lang w:val="en-US"/>
+          <w14:ligatures w14:val="none"/>
+        </w:rPr>
+        <w:t xml:space="preserve"> </w:t>
+      </w:r>
+      <w:proofErr w:type="gramStart"/>
+      <w:r>
+        <w:rPr>
+          <w:rFonts w:eastAsia="Times New Roman" w:cs="Times New Roman"/>
+          <w:kern w:val="0"/>
+          <w:sz w:val="24"/>
+          <w:lang w:val="en-US"/>
+          <w14:ligatures w14:val="none"/>
+        </w:rPr>
+        <w:t>payment-service</w:t>
+      </w:r>
+      <w:proofErr w:type="gramEnd"/>
+    </w:p>
+    <w:p>
+      <w:pPr>
+        <w:spacing w:after="0" w:line="240" w:lineRule="auto"/>
+        <w:rPr>
+          <w:rFonts w:eastAsia="Times New Roman" w:cs="Times New Roman"/>
+          <w:kern w:val="0"/>
+          <w:sz w:val="24"/>
+          <w:lang w:val="en-US"/>
+          <w14:ligatures w14:val="none"/>
+        </w:rPr>
+      </w:pPr>
+      <w:r>
+        <w:rPr>
+          <w:rFonts w:eastAsia="Times New Roman" w:cs="Times New Roman"/>
+          <w:kern w:val="0"/>
+          <w:sz w:val="24"/>
+          <w:lang w:val="en-US"/>
+          <w14:ligatures w14:val="none"/>
+        </w:rPr>
         <w:t> </w:t>
       </w:r>
     </w:p>
@@ -17034,6 +18309,7 @@
           <w14:ligatures w14:val="none"/>
         </w:rPr>
       </w:pPr>
+      <w:proofErr w:type="gramStart"/>
       <w:r>
         <w:rPr>
           <w:rFonts w:eastAsia="Times New Roman" w:cs="Times New Roman"/>
@@ -17056,6 +18332,7 @@
         </w:rPr>
         <w:t>Namespace</w:t>
       </w:r>
+      <w:proofErr w:type="gramEnd"/>
       <w:r>
         <w:rPr>
           <w:rFonts w:eastAsia="Times New Roman" w:cs="Times New Roman"/>
@@ -17175,7 +18452,85 @@
           <w:lang w:val="en-US"/>
           <w14:ligatures w14:val="none"/>
         </w:rPr>
-        <w:t xml:space="preserve">Environments ( dev , qa , prod ) </w:t>
+        <w:t xml:space="preserve">Environments </w:t>
+      </w:r>
+      <w:proofErr w:type="gramStart"/>
+      <w:r>
+        <w:rPr>
+          <w:rFonts w:eastAsia="Times New Roman" w:cs="Times New Roman"/>
+          <w:kern w:val="0"/>
+          <w:sz w:val="24"/>
+          <w:lang w:val="en-US"/>
+          <w14:ligatures w14:val="none"/>
+        </w:rPr>
+        <w:t>( dev</w:t>
+      </w:r>
+      <w:proofErr w:type="gramEnd"/>
+      <w:r>
+        <w:rPr>
+          <w:rFonts w:eastAsia="Times New Roman" w:cs="Times New Roman"/>
+          <w:kern w:val="0"/>
+          <w:sz w:val="24"/>
+          <w:lang w:val="en-US"/>
+          <w14:ligatures w14:val="none"/>
+        </w:rPr>
+        <w:t xml:space="preserve"> , </w:t>
+      </w:r>
+      <w:proofErr w:type="spellStart"/>
+      <w:proofErr w:type="gramStart"/>
+      <w:r>
+        <w:rPr>
+          <w:rFonts w:eastAsia="Times New Roman" w:cs="Times New Roman"/>
+          <w:kern w:val="0"/>
+          <w:sz w:val="24"/>
+          <w:lang w:val="en-US"/>
+          <w14:ligatures w14:val="none"/>
+        </w:rPr>
+        <w:t>qa</w:t>
+      </w:r>
+      <w:proofErr w:type="spellEnd"/>
+      <w:r>
+        <w:rPr>
+          <w:rFonts w:eastAsia="Times New Roman" w:cs="Times New Roman"/>
+          <w:kern w:val="0"/>
+          <w:sz w:val="24"/>
+          <w:lang w:val="en-US"/>
+          <w14:ligatures w14:val="none"/>
+        </w:rPr>
+        <w:t xml:space="preserve"> ,</w:t>
+      </w:r>
+      <w:proofErr w:type="gramEnd"/>
+      <w:r>
+        <w:rPr>
+          <w:rFonts w:eastAsia="Times New Roman" w:cs="Times New Roman"/>
+          <w:kern w:val="0"/>
+          <w:sz w:val="24"/>
+          <w:lang w:val="en-US"/>
+          <w14:ligatures w14:val="none"/>
+        </w:rPr>
+        <w:t xml:space="preserve"> </w:t>
+      </w:r>
+      <w:proofErr w:type="gramStart"/>
+      <w:r>
+        <w:rPr>
+          <w:rFonts w:eastAsia="Times New Roman" w:cs="Times New Roman"/>
+          <w:kern w:val="0"/>
+          <w:sz w:val="24"/>
+          <w:lang w:val="en-US"/>
+          <w14:ligatures w14:val="none"/>
+        </w:rPr>
+        <w:t>prod )</w:t>
+      </w:r>
+      <w:proofErr w:type="gramEnd"/>
+      <w:r>
+        <w:rPr>
+          <w:rFonts w:eastAsia="Times New Roman" w:cs="Times New Roman"/>
+          <w:kern w:val="0"/>
+          <w:sz w:val="24"/>
+          <w:lang w:val="en-US"/>
+          <w14:ligatures w14:val="none"/>
+        </w:rPr>
+        <w:t xml:space="preserve"> </w:t>
       </w:r>
     </w:p>
     <w:p>
@@ -17270,295 +18625,1700 @@
           <w:lang w:val="en-US"/>
           <w14:ligatures w14:val="none"/>
         </w:rPr>
-        <w:t>Horizontal Pod Autoscaler (HPA).</w:t>
-      </w:r>
-    </w:p>
-    <w:p>
-      <w:pPr>
-        <w:spacing w:after="0" w:line="240" w:lineRule="auto"/>
-        <w:rPr>
-          <w:rFonts w:eastAsia="Times New Roman" w:cs="Times New Roman"/>
-          <w:kern w:val="0"/>
-          <w:sz w:val="24"/>
-          <w:lang w:val="en-US"/>
-          <w14:ligatures w14:val="none"/>
-        </w:rPr>
-      </w:pPr>
-      <w:r>
-        <w:rPr>
-          <w:rFonts w:eastAsia="Times New Roman" w:cs="Times New Roman"/>
-          <w:kern w:val="0"/>
-          <w:sz w:val="24"/>
-          <w:lang w:val="en-US"/>
-          <w14:ligatures w14:val="none"/>
-        </w:rPr>
-        <w:t> </w:t>
-      </w:r>
-    </w:p>
-    <w:p>
-      <w:pPr>
-        <w:spacing w:after="0" w:line="240" w:lineRule="auto"/>
-        <w:rPr>
-          <w:rFonts w:eastAsia="Times New Roman" w:cs="Times New Roman"/>
-          <w:kern w:val="0"/>
-          <w:sz w:val="24"/>
-          <w:lang w:val="en-US"/>
-          <w14:ligatures w14:val="none"/>
-        </w:rPr>
-      </w:pPr>
-      <w:r>
-        <w:rPr>
-          <w:rFonts w:eastAsia="Times New Roman" w:cs="Times New Roman"/>
-          <w:kern w:val="0"/>
-          <w:sz w:val="24"/>
-          <w:lang w:val="en-US"/>
-          <w14:ligatures w14:val="none"/>
-        </w:rPr>
-        <w:t>Example:</w:t>
-      </w:r>
-    </w:p>
-    <w:p>
-      <w:pPr>
-        <w:spacing w:after="0" w:line="240" w:lineRule="auto"/>
-        <w:rPr>
-          <w:rFonts w:eastAsia="Times New Roman" w:cs="Times New Roman"/>
-          <w:kern w:val="0"/>
-          <w:sz w:val="24"/>
-          <w:lang w:val="en-US"/>
-          <w14:ligatures w14:val="none"/>
-        </w:rPr>
-      </w:pPr>
-      <w:r>
-        <w:rPr>
-          <w:rFonts w:eastAsia="Times New Roman" w:cs="Times New Roman"/>
-          <w:kern w:val="0"/>
-          <w:sz w:val="24"/>
-          <w:lang w:val="en-US"/>
-          <w14:ligatures w14:val="none"/>
-        </w:rPr>
-        <w:t> </w:t>
-      </w:r>
-    </w:p>
-    <w:p>
-      <w:pPr>
-        <w:spacing w:after="0" w:line="240" w:lineRule="auto"/>
-        <w:rPr>
-          <w:rFonts w:eastAsia="Times New Roman" w:cs="Times New Roman"/>
-          <w:kern w:val="0"/>
-          <w:sz w:val="24"/>
-          <w:lang w:val="en-US"/>
-          <w14:ligatures w14:val="none"/>
-        </w:rPr>
-      </w:pPr>
-      <w:r>
-        <w:rPr>
-          <w:rFonts w:eastAsia="Times New Roman" w:cs="Times New Roman"/>
-          <w:kern w:val="0"/>
-          <w:sz w:val="24"/>
-          <w:lang w:val="en-US"/>
-          <w14:ligatures w14:val="none"/>
-        </w:rPr>
-        <w:t>CPU &gt; 80%</w:t>
-      </w:r>
-    </w:p>
-    <w:p>
-      <w:pPr>
-        <w:spacing w:after="0" w:line="240" w:lineRule="auto"/>
-        <w:rPr>
-          <w:rFonts w:eastAsia="Times New Roman" w:cs="Times New Roman"/>
-          <w:kern w:val="0"/>
-          <w:sz w:val="24"/>
-          <w:lang w:val="en-US"/>
-          <w14:ligatures w14:val="none"/>
-        </w:rPr>
-      </w:pPr>
-      <w:r>
-        <w:rPr>
-          <w:rFonts w:eastAsia="Times New Roman" w:cs="Times New Roman"/>
-          <w:kern w:val="0"/>
-          <w:sz w:val="24"/>
-          <w:lang w:val="en-US"/>
-          <w14:ligatures w14:val="none"/>
-        </w:rPr>
-        <w:t>Increase Pods from 3 → 10</w:t>
-      </w:r>
-    </w:p>
-    <w:p>
-      <w:pPr>
-        <w:rPr>
-          <w:szCs w:val="28"/>
-          <w:lang w:val="en-US"/>
-        </w:rPr>
-      </w:pPr>
-    </w:p>
-    <w:p>
-      <w:pPr>
-        <w:pStyle w:val="Heading2"/>
-        <w:rPr>
-          <w:lang w:val="en-US"/>
-        </w:rPr>
-      </w:pPr>
-      <w:r>
-        <w:rPr>
-          <w:lang w:val="en-US"/>
-        </w:rPr>
-        <w:t>ECS tasks and EKS pods</w:t>
-      </w:r>
-    </w:p>
-    <w:p>
-      <w:pPr>
-        <w:rPr>
-          <w:lang w:val="en-US"/>
-        </w:rPr>
-      </w:pPr>
-      <w:r>
-        <w:rPr>
-          <w:lang w:val="en-US"/>
-        </w:rPr>
-        <w:t>ECS tasks</w:t>
-      </w:r>
-    </w:p>
-    <w:p>
-      <w:r>
-        <w:rPr>
-          <w:rFonts w:ascii="Segoe UI Emoji" w:hAnsi="Segoe UI Emoji" w:cs="Segoe UI Emoji"/>
-        </w:rPr>
-        <w:t>✅</w:t>
-      </w:r>
-      <w:r>
-        <w:t xml:space="preserve"> Simpler setup</w:t>
-      </w:r>
-    </w:p>
-    <w:p>
-      <w:r>
-        <w:rPr>
-          <w:rFonts w:ascii="Segoe UI Emoji" w:hAnsi="Segoe UI Emoji" w:cs="Segoe UI Emoji"/>
-        </w:rPr>
-        <w:t>✅</w:t>
-      </w:r>
-      <w:r>
-        <w:t xml:space="preserve"> Less operational overhead</w:t>
-      </w:r>
-    </w:p>
-    <w:p>
-      <w:r>
-        <w:rPr>
-          <w:rFonts w:ascii="Segoe UI Emoji" w:hAnsi="Segoe UI Emoji" w:cs="Segoe UI Emoji"/>
-        </w:rPr>
-        <w:t>✅</w:t>
-      </w:r>
-      <w:r>
-        <w:t xml:space="preserve"> AWS manages orchestration</w:t>
-      </w:r>
-    </w:p>
-    <w:p>
-      <w:r>
-        <w:rPr>
-          <w:rFonts w:ascii="Segoe UI Emoji" w:hAnsi="Segoe UI Emoji" w:cs="Segoe UI Emoji"/>
-        </w:rPr>
-        <w:t>✅</w:t>
-      </w:r>
-      <w:r>
-        <w:t xml:space="preserve"> Good for small to medium microservice landscapes</w:t>
-      </w:r>
-    </w:p>
-    <w:p>
-      <w:r>
-        <w:rPr>
+        <w:t xml:space="preserve">Horizontal Pod </w:t>
+      </w:r>
+      <w:proofErr w:type="spellStart"/>
+      <w:r>
+        <w:rPr>
+          <w:rFonts w:eastAsia="Times New Roman" w:cs="Times New Roman"/>
           <w:b/>
           <w:bCs/>
-        </w:rPr>
-        <w:t>Best Use Case:</w:t>
-      </w:r>
-    </w:p>
-    <w:p>
-      <w:r>
-        <w:t>Teams that want container orchestration without managing Kubernetes.</w:t>
-      </w:r>
-    </w:p>
-    <w:p>
-      <w:pPr>
-        <w:rPr>
-          <w:lang w:val="en-US"/>
-        </w:rPr>
-      </w:pPr>
-    </w:p>
-    <w:p>
-      <w:r>
-        <w:t>EKS Pods</w:t>
-      </w:r>
-    </w:p>
-    <w:p>
-      <w:r>
-        <w:rPr>
-          <w:rFonts w:ascii="Segoe UI Emoji" w:hAnsi="Segoe UI Emoji" w:cs="Segoe UI Emoji"/>
-        </w:rPr>
-        <w:t>✅</w:t>
-      </w:r>
-      <w:r>
-        <w:t xml:space="preserve"> Kubernetes standard</w:t>
-      </w:r>
-    </w:p>
-    <w:p>
-      <w:r>
-        <w:rPr>
-          <w:rFonts w:ascii="Segoe UI Emoji" w:hAnsi="Segoe UI Emoji" w:cs="Segoe UI Emoji"/>
-        </w:rPr>
-        <w:t>✅</w:t>
-      </w:r>
-      <w:r>
-        <w:t xml:space="preserve"> Advanced deployment strategies</w:t>
-      </w:r>
-    </w:p>
-    <w:p>
-      <w:r>
-        <w:rPr>
-          <w:rFonts w:ascii="Segoe UI Emoji" w:hAnsi="Segoe UI Emoji" w:cs="Segoe UI Emoji"/>
-        </w:rPr>
-        <w:t>✅</w:t>
-      </w:r>
-      <w:r>
-        <w:t xml:space="preserve"> Service mesh support</w:t>
-      </w:r>
-      <w:r>
-        <w:t xml:space="preserve"> ( need to check this )</w:t>
-      </w:r>
-    </w:p>
-    <w:p>
-      <w:r>
-        <w:rPr>
-          <w:rFonts w:ascii="Segoe UI Emoji" w:hAnsi="Segoe UI Emoji" w:cs="Segoe UI Emoji"/>
-        </w:rPr>
-        <w:t>✅</w:t>
-      </w:r>
-      <w:r>
-        <w:t xml:space="preserve"> Multi-cloud portability</w:t>
-      </w:r>
-    </w:p>
-    <w:p>
-      <w:r>
-        <w:rPr>
-          <w:rFonts w:ascii="Segoe UI Emoji" w:hAnsi="Segoe UI Emoji" w:cs="Segoe UI Emoji"/>
-        </w:rPr>
-        <w:t>✅</w:t>
-      </w:r>
-      <w:r>
-        <w:t xml:space="preserve"> Large-scale microservice ecosystems</w:t>
-      </w:r>
-    </w:p>
-    <w:p>
-      <w:r>
-        <w:rPr>
+          <w:kern w:val="0"/>
+          <w:sz w:val="24"/>
+          <w:lang w:val="en-US"/>
+          <w14:ligatures w14:val="none"/>
+        </w:rPr>
+        <w:t>Autoscaler</w:t>
+      </w:r>
+      <w:proofErr w:type="spellEnd"/>
+      <w:r>
+        <w:rPr>
+          <w:rFonts w:eastAsia="Times New Roman" w:cs="Times New Roman"/>
           <w:b/>
           <w:bCs/>
+          <w:kern w:val="0"/>
+          <w:sz w:val="24"/>
+          <w:lang w:val="en-US"/>
+          <w14:ligatures w14:val="none"/>
+        </w:rPr>
+        <w:t xml:space="preserve"> (HPA).</w:t>
+      </w:r>
+    </w:p>
+    <w:p>
+      <w:pPr>
+        <w:spacing w:after="0" w:line="240" w:lineRule="auto"/>
+        <w:rPr>
+          <w:rFonts w:eastAsia="Times New Roman" w:cs="Times New Roman"/>
+          <w:kern w:val="0"/>
+          <w:sz w:val="24"/>
+          <w:lang w:val="en-US"/>
+          <w14:ligatures w14:val="none"/>
+        </w:rPr>
+      </w:pPr>
+      <w:r>
+        <w:rPr>
+          <w:rFonts w:eastAsia="Times New Roman" w:cs="Times New Roman"/>
+          <w:kern w:val="0"/>
+          <w:sz w:val="24"/>
+          <w:lang w:val="en-US"/>
+          <w14:ligatures w14:val="none"/>
+        </w:rPr>
+        <w:t> </w:t>
+      </w:r>
+    </w:p>
+    <w:p>
+      <w:pPr>
+        <w:spacing w:after="0" w:line="240" w:lineRule="auto"/>
+        <w:rPr>
+          <w:rFonts w:eastAsia="Times New Roman" w:cs="Times New Roman"/>
+          <w:kern w:val="0"/>
+          <w:sz w:val="24"/>
+          <w:lang w:val="en-US"/>
+          <w14:ligatures w14:val="none"/>
+        </w:rPr>
+      </w:pPr>
+      <w:r>
+        <w:rPr>
+          <w:rFonts w:eastAsia="Times New Roman" w:cs="Times New Roman"/>
+          <w:kern w:val="0"/>
+          <w:sz w:val="24"/>
+          <w:lang w:val="en-US"/>
+          <w14:ligatures w14:val="none"/>
+        </w:rPr>
+        <w:t>Example:</w:t>
+      </w:r>
+    </w:p>
+    <w:p>
+      <w:pPr>
+        <w:spacing w:after="0" w:line="240" w:lineRule="auto"/>
+        <w:rPr>
+          <w:rFonts w:eastAsia="Times New Roman" w:cs="Times New Roman"/>
+          <w:kern w:val="0"/>
+          <w:sz w:val="24"/>
+          <w:lang w:val="en-US"/>
+          <w14:ligatures w14:val="none"/>
+        </w:rPr>
+      </w:pPr>
+      <w:r>
+        <w:rPr>
+          <w:rFonts w:eastAsia="Times New Roman" w:cs="Times New Roman"/>
+          <w:kern w:val="0"/>
+          <w:sz w:val="24"/>
+          <w:lang w:val="en-US"/>
+          <w14:ligatures w14:val="none"/>
+        </w:rPr>
+        <w:t> </w:t>
+      </w:r>
+    </w:p>
+    <w:p>
+      <w:pPr>
+        <w:spacing w:after="0" w:line="240" w:lineRule="auto"/>
+        <w:rPr>
+          <w:rFonts w:eastAsia="Times New Roman" w:cs="Times New Roman"/>
+          <w:kern w:val="0"/>
+          <w:sz w:val="24"/>
+          <w:lang w:val="en-US"/>
+          <w14:ligatures w14:val="none"/>
+        </w:rPr>
+      </w:pPr>
+      <w:r>
+        <w:rPr>
+          <w:rFonts w:eastAsia="Times New Roman" w:cs="Times New Roman"/>
+          <w:kern w:val="0"/>
+          <w:sz w:val="24"/>
+          <w:lang w:val="en-US"/>
+          <w14:ligatures w14:val="none"/>
+        </w:rPr>
+        <w:t>CPU &gt; 80%</w:t>
+      </w:r>
+    </w:p>
+    <w:p>
+      <w:pPr>
+        <w:spacing w:after="0" w:line="240" w:lineRule="auto"/>
+        <w:rPr>
+          <w:rFonts w:eastAsia="Times New Roman" w:cs="Times New Roman"/>
+          <w:kern w:val="0"/>
+          <w:sz w:val="24"/>
+          <w:lang w:val="en-US"/>
+          <w14:ligatures w14:val="none"/>
+        </w:rPr>
+      </w:pPr>
+      <w:r>
+        <w:rPr>
+          <w:rFonts w:eastAsia="Times New Roman" w:cs="Times New Roman"/>
+          <w:kern w:val="0"/>
+          <w:sz w:val="24"/>
+          <w:lang w:val="en-US"/>
+          <w14:ligatures w14:val="none"/>
+        </w:rPr>
+        <w:t>Increase Pods from 3 → 10</w:t>
+      </w:r>
+    </w:p>
+    <w:p>
+      <w:pPr>
+        <w:rPr>
+          <w:szCs w:val="28"/>
+          <w:lang w:val="en-US"/>
+        </w:rPr>
+      </w:pPr>
+    </w:p>
+    <w:p>
+      <w:pPr>
+        <w:pStyle w:val="Heading2"/>
+        <w:rPr>
+          <w:lang w:val="en-US"/>
+        </w:rPr>
+      </w:pPr>
+      <w:r>
+        <w:rPr>
+          <w:lang w:val="en-US"/>
+        </w:rPr>
+        <w:t>ECS tasks and EKS pods</w:t>
+      </w:r>
+    </w:p>
+    <w:p>
+      <w:pPr>
+        <w:rPr>
+          <w:lang w:val="en-US"/>
+        </w:rPr>
+      </w:pPr>
+      <w:r>
+        <w:rPr>
+          <w:lang w:val="en-US"/>
+        </w:rPr>
+        <w:t>ECS tasks</w:t>
+      </w:r>
+    </w:p>
+    <w:p>
+      <w:r>
+        <w:rPr>
+          <w:rFonts w:ascii="Segoe UI Emoji" w:hAnsi="Segoe UI Emoji" w:cs="Segoe UI Emoji"/>
+        </w:rPr>
+        <w:t>✅</w:t>
+      </w:r>
+      <w:r>
+        <w:t xml:space="preserve"> Simpler setup</w:t>
+      </w:r>
+    </w:p>
+    <w:p>
+      <w:r>
+        <w:rPr>
+          <w:rFonts w:ascii="Segoe UI Emoji" w:hAnsi="Segoe UI Emoji" w:cs="Segoe UI Emoji"/>
+        </w:rPr>
+        <w:t>✅</w:t>
+      </w:r>
+      <w:r>
+        <w:t xml:space="preserve"> Less operational overhead</w:t>
+      </w:r>
+    </w:p>
+    <w:p>
+      <w:r>
+        <w:rPr>
+          <w:rFonts w:ascii="Segoe UI Emoji" w:hAnsi="Segoe UI Emoji" w:cs="Segoe UI Emoji"/>
+        </w:rPr>
+        <w:t>✅</w:t>
+      </w:r>
+      <w:r>
+        <w:t xml:space="preserve"> AWS manages orchestration</w:t>
+      </w:r>
+    </w:p>
+    <w:p>
+      <w:r>
+        <w:rPr>
+          <w:rFonts w:ascii="Segoe UI Emoji" w:hAnsi="Segoe UI Emoji" w:cs="Segoe UI Emoji"/>
+        </w:rPr>
+        <w:t>✅</w:t>
+      </w:r>
+      <w:r>
+        <w:t xml:space="preserve"> Good for small to medium microservice landscapes</w:t>
+      </w:r>
+    </w:p>
+    <w:p>
+      <w:r>
+        <w:rPr>
+          <w:b/>
+          <w:bCs/>
         </w:rPr>
         <w:t>Best Use Case:</w:t>
       </w:r>
     </w:p>
     <w:p>
       <w:r>
+        <w:t>Teams that want container orchestration without managing Kubernetes.</w:t>
+      </w:r>
+    </w:p>
+    <w:p>
+      <w:pPr>
+        <w:rPr>
+          <w:lang w:val="en-US"/>
+        </w:rPr>
+      </w:pPr>
+    </w:p>
+    <w:p>
+      <w:r>
+        <w:t>EKS Pods</w:t>
+      </w:r>
+    </w:p>
+    <w:p>
+      <w:r>
+        <w:rPr>
+          <w:rFonts w:ascii="Segoe UI Emoji" w:hAnsi="Segoe UI Emoji" w:cs="Segoe UI Emoji"/>
+        </w:rPr>
+        <w:t>✅</w:t>
+      </w:r>
+      <w:r>
+        <w:t xml:space="preserve"> Kubernetes standard</w:t>
+      </w:r>
+    </w:p>
+    <w:p>
+      <w:r>
+        <w:rPr>
+          <w:rFonts w:ascii="Segoe UI Emoji" w:hAnsi="Segoe UI Emoji" w:cs="Segoe UI Emoji"/>
+        </w:rPr>
+        <w:t>✅</w:t>
+      </w:r>
+      <w:r>
+        <w:t xml:space="preserve"> Advanced deployment strategies</w:t>
+      </w:r>
+    </w:p>
+    <w:p>
+      <w:r>
+        <w:rPr>
+          <w:rFonts w:ascii="Segoe UI Emoji" w:hAnsi="Segoe UI Emoji" w:cs="Segoe UI Emoji"/>
+        </w:rPr>
+        <w:t>✅</w:t>
+      </w:r>
+      <w:r>
+        <w:t xml:space="preserve"> Service mesh support</w:t>
+      </w:r>
+      <w:r>
+        <w:t xml:space="preserve"> </w:t>
+      </w:r>
+      <w:proofErr w:type="gramStart"/>
+      <w:r>
+        <w:t>( need</w:t>
+      </w:r>
+      <w:proofErr w:type="gramEnd"/>
+      <w:r>
+        <w:t xml:space="preserve"> to check </w:t>
+      </w:r>
+      <w:proofErr w:type="gramStart"/>
+      <w:r>
+        <w:t>this )</w:t>
+      </w:r>
+      <w:proofErr w:type="gramEnd"/>
+    </w:p>
+    <w:p>
+      <w:r>
+        <w:rPr>
+          <w:rFonts w:ascii="Segoe UI Emoji" w:hAnsi="Segoe UI Emoji" w:cs="Segoe UI Emoji"/>
+        </w:rPr>
+        <w:t>✅</w:t>
+      </w:r>
+      <w:r>
+        <w:t xml:space="preserve"> </w:t>
+      </w:r>
+      <w:proofErr w:type="gramStart"/>
+      <w:r>
+        <w:t>Multi-cloud</w:t>
+      </w:r>
+      <w:proofErr w:type="gramEnd"/>
+      <w:r>
+        <w:t xml:space="preserve"> portability</w:t>
+      </w:r>
+    </w:p>
+    <w:p>
+      <w:r>
+        <w:rPr>
+          <w:rFonts w:ascii="Segoe UI Emoji" w:hAnsi="Segoe UI Emoji" w:cs="Segoe UI Emoji"/>
+        </w:rPr>
+        <w:t>✅</w:t>
+      </w:r>
+      <w:r>
+        <w:t xml:space="preserve"> Large-scale microservice ecosystems</w:t>
+      </w:r>
+    </w:p>
+    <w:p>
+      <w:r>
+        <w:rPr>
+          <w:b/>
+          <w:bCs/>
+        </w:rPr>
+        <w:t>Best Use Case:</w:t>
+      </w:r>
+    </w:p>
+    <w:p>
+      <w:r>
         <w:t>Organizations already using Kubernetes or requiring advanced workload orchestration.</w:t>
       </w:r>
+    </w:p>
+    <w:p>
+      <w:pPr>
+        <w:pStyle w:val="Heading1"/>
+      </w:pPr>
+      <w:proofErr w:type="gramStart"/>
+      <w:r>
+        <w:lastRenderedPageBreak/>
+        <w:t>Scenario based</w:t>
+      </w:r>
+      <w:proofErr w:type="gramEnd"/>
+      <w:r>
+        <w:t xml:space="preserve"> questions</w:t>
+      </w:r>
+    </w:p>
+    <w:p>
+      <w:pPr>
+        <w:pStyle w:val="Heading2"/>
+        <w:rPr>
+          <w:lang w:val="en-US"/>
+        </w:rPr>
+      </w:pPr>
+      <w:r>
+        <w:rPr>
+          <w:lang w:val="en-US"/>
+        </w:rPr>
+        <w:t>Handling concurrent updates in inventory stock</w:t>
+      </w:r>
+    </w:p>
+    <w:p>
+      <w:pPr>
+        <w:rPr>
+          <w:lang w:val="en-US"/>
+        </w:rPr>
+      </w:pPr>
+      <w:r>
+        <w:rPr>
+          <w:lang w:val="en-US"/>
+        </w:rPr>
+        <w:t xml:space="preserve">Let's say there are two concurrent requests </w:t>
+      </w:r>
+      <w:proofErr w:type="gramStart"/>
+      <w:r>
+        <w:rPr>
+          <w:lang w:val="en-US"/>
+        </w:rPr>
+        <w:t>( updates</w:t>
+      </w:r>
+      <w:proofErr w:type="gramEnd"/>
+      <w:r>
+        <w:rPr>
+          <w:lang w:val="en-US"/>
+        </w:rPr>
+        <w:t xml:space="preserve"> ) </w:t>
+      </w:r>
+      <w:proofErr w:type="gramStart"/>
+      <w:r>
+        <w:rPr>
+          <w:lang w:val="en-US"/>
+        </w:rPr>
+        <w:t>to</w:t>
+      </w:r>
+      <w:proofErr w:type="gramEnd"/>
+      <w:r>
+        <w:rPr>
+          <w:lang w:val="en-US"/>
+        </w:rPr>
+        <w:t xml:space="preserve"> a database going to different instances of the </w:t>
+      </w:r>
+      <w:proofErr w:type="gramStart"/>
+      <w:r>
+        <w:rPr>
+          <w:lang w:val="en-US"/>
+        </w:rPr>
+        <w:t>service ,</w:t>
+      </w:r>
+      <w:proofErr w:type="gramEnd"/>
+      <w:r>
+        <w:rPr>
+          <w:lang w:val="en-US"/>
+        </w:rPr>
+        <w:t xml:space="preserve"> how would we handle such a </w:t>
+      </w:r>
+      <w:proofErr w:type="gramStart"/>
+      <w:r>
+        <w:rPr>
+          <w:lang w:val="en-US"/>
+        </w:rPr>
+        <w:t>scenario ?</w:t>
+      </w:r>
+      <w:proofErr w:type="gramEnd"/>
+    </w:p>
+    <w:p>
+      <w:pPr>
+        <w:rPr>
+          <w:lang w:val="en-US"/>
+        </w:rPr>
+      </w:pPr>
+      <w:r>
+        <w:rPr>
+          <w:lang w:val="en-US"/>
+        </w:rPr>
+        <w:t xml:space="preserve">To add more </w:t>
+      </w:r>
+      <w:proofErr w:type="gramStart"/>
+      <w:r>
+        <w:rPr>
+          <w:lang w:val="en-US"/>
+        </w:rPr>
+        <w:t>context ,</w:t>
+      </w:r>
+      <w:proofErr w:type="gramEnd"/>
+      <w:r>
+        <w:rPr>
+          <w:lang w:val="en-US"/>
+        </w:rPr>
+        <w:t xml:space="preserve"> let's say there are two requests which are trying to update a stock </w:t>
+      </w:r>
+      <w:proofErr w:type="gramStart"/>
+      <w:r>
+        <w:rPr>
+          <w:lang w:val="en-US"/>
+        </w:rPr>
+        <w:t>inventory ,</w:t>
+      </w:r>
+      <w:proofErr w:type="gramEnd"/>
+      <w:r>
+        <w:rPr>
+          <w:lang w:val="en-US"/>
+        </w:rPr>
+        <w:t xml:space="preserve"> how can you make sure </w:t>
+      </w:r>
+    </w:p>
+    <w:p>
+      <w:pPr>
+        <w:rPr>
+          <w:lang w:val="en-US"/>
+        </w:rPr>
+      </w:pPr>
+      <w:r>
+        <w:rPr>
+          <w:lang w:val="en-US"/>
+        </w:rPr>
+        <w:t xml:space="preserve">that the stock inventory does not go </w:t>
+      </w:r>
+      <w:proofErr w:type="gramStart"/>
+      <w:r>
+        <w:rPr>
+          <w:lang w:val="en-US"/>
+        </w:rPr>
+        <w:t>negative ?</w:t>
+      </w:r>
+      <w:proofErr w:type="gramEnd"/>
+      <w:r>
+        <w:rPr>
+          <w:lang w:val="en-US"/>
+        </w:rPr>
+        <w:t xml:space="preserve"> </w:t>
+      </w:r>
+    </w:p>
+    <w:p>
+      <w:pPr>
+        <w:rPr>
+          <w:lang w:val="en-US"/>
+        </w:rPr>
+      </w:pPr>
+    </w:p>
+    <w:p>
+      <w:pPr>
+        <w:rPr>
+          <w:lang w:val="en-US"/>
+        </w:rPr>
+      </w:pPr>
+      <w:r>
+        <w:rPr>
+          <w:lang w:val="en-US"/>
+        </w:rPr>
+        <w:t xml:space="preserve">Explain </w:t>
+      </w:r>
+      <w:r>
+        <w:rPr>
+          <w:lang w:val="en-US"/>
+        </w:rPr>
+        <w:t>both cases</w:t>
+      </w:r>
+      <w:r>
+        <w:rPr>
+          <w:lang w:val="en-US"/>
+        </w:rPr>
+        <w:t xml:space="preserve"> here.</w:t>
+      </w:r>
+    </w:p>
+    <w:p>
+      <w:pPr>
+        <w:rPr>
+          <w:lang w:val="en-US"/>
+        </w:rPr>
+      </w:pPr>
+      <w:proofErr w:type="spellStart"/>
+      <w:r>
+        <w:rPr>
+          <w:lang w:val="en-US"/>
+        </w:rPr>
+        <w:t>i</w:t>
+      </w:r>
+      <w:proofErr w:type="spellEnd"/>
+      <w:r>
+        <w:rPr>
+          <w:lang w:val="en-US"/>
+        </w:rPr>
+        <w:t>) When both requests come to the same instance of the service.</w:t>
+      </w:r>
+    </w:p>
+    <w:p>
+      <w:pPr>
+        <w:rPr>
+          <w:lang w:val="en-US"/>
+        </w:rPr>
+      </w:pPr>
+      <w:r>
+        <w:rPr>
+          <w:lang w:val="en-US"/>
+        </w:rPr>
+        <w:t>ii)When both the requests go to the different instances of the service.</w:t>
+      </w:r>
+      <w:r>
+        <w:rPr>
+          <w:lang w:val="en-US"/>
+        </w:rPr>
+        <w:t xml:space="preserve"> </w:t>
+      </w:r>
+    </w:p>
+    <w:p>
+      <w:pPr>
+        <w:rPr>
+          <w:lang w:val="en-US"/>
+        </w:rPr>
+      </w:pPr>
+    </w:p>
+    <w:p>
+      <w:pPr>
+        <w:rPr>
+          <w:lang w:val="en-US"/>
+        </w:rPr>
+      </w:pPr>
+      <w:proofErr w:type="gramStart"/>
+      <w:r>
+        <w:rPr>
+          <w:lang w:val="en-US"/>
+        </w:rPr>
+        <w:t>Answer :</w:t>
+      </w:r>
+      <w:proofErr w:type="gramEnd"/>
+    </w:p>
+    <w:p>
+      <w:r>
+        <w:t>D</w:t>
+      </w:r>
+      <w:r>
+        <w:t>on’t rely on application-instance locking to protect shared stock. The database must enforce the concurrency rule.</w:t>
+      </w:r>
+    </w:p>
+    <w:p>
+      <w:pPr>
+        <w:rPr>
+          <w:b/>
+          <w:bCs/>
+        </w:rPr>
+      </w:pPr>
+      <w:r>
+        <w:rPr>
+          <w:b/>
+          <w:bCs/>
+        </w:rPr>
+        <w:t>Use a row level locking</w:t>
+      </w:r>
+    </w:p>
+    <w:p>
+      <w:r>
+        <w:t>T</w:t>
+      </w:r>
+      <w:r>
+        <w:t xml:space="preserve">he database temporarily locks </w:t>
+      </w:r>
+      <w:r>
+        <w:rPr>
+          <w:b/>
+          <w:bCs/>
+        </w:rPr>
+        <w:t>one specific row</w:t>
+      </w:r>
+      <w:r>
+        <w:t xml:space="preserve"> so that other transactions cannot modify that row until the first transaction finishes.</w:t>
+      </w:r>
+    </w:p>
+    <w:p>
+      <w:pPr>
+        <w:rPr>
+          <w:lang w:val="en-US"/>
+        </w:rPr>
+      </w:pPr>
+    </w:p>
+    <w:p>
+      <w:pPr>
+        <w:rPr>
+          <w:color w:val="0070C0"/>
+          <w:lang w:val="en-US"/>
+        </w:rPr>
+      </w:pPr>
+      <w:r>
+        <w:rPr>
+          <w:color w:val="0070C0"/>
+          <w:lang w:val="en-US"/>
+        </w:rPr>
+        <w:t>BEGIN;</w:t>
+      </w:r>
+    </w:p>
+    <w:p>
+      <w:pPr>
+        <w:rPr>
+          <w:color w:val="0070C0"/>
+          <w:lang w:val="en-US"/>
+        </w:rPr>
+      </w:pPr>
+    </w:p>
+    <w:p>
+      <w:pPr>
+        <w:rPr>
+          <w:color w:val="0070C0"/>
+          <w:lang w:val="en-US"/>
+        </w:rPr>
+      </w:pPr>
+      <w:r>
+        <w:rPr>
+          <w:color w:val="0070C0"/>
+          <w:lang w:val="en-US"/>
+        </w:rPr>
+        <w:t>SELECT stock</w:t>
+      </w:r>
+    </w:p>
+    <w:p>
+      <w:pPr>
+        <w:rPr>
+          <w:color w:val="0070C0"/>
+          <w:lang w:val="en-US"/>
+        </w:rPr>
+      </w:pPr>
+      <w:r>
+        <w:rPr>
+          <w:color w:val="0070C0"/>
+          <w:lang w:val="en-US"/>
+        </w:rPr>
+        <w:t>FROM inventory</w:t>
+      </w:r>
+    </w:p>
+    <w:p>
+      <w:pPr>
+        <w:rPr>
+          <w:color w:val="0070C0"/>
+          <w:lang w:val="en-US"/>
+        </w:rPr>
+      </w:pPr>
+      <w:r>
+        <w:rPr>
+          <w:color w:val="0070C0"/>
+          <w:lang w:val="en-US"/>
+        </w:rPr>
+        <w:t xml:space="preserve">WHERE </w:t>
+      </w:r>
+      <w:proofErr w:type="spellStart"/>
+      <w:r>
+        <w:rPr>
+          <w:color w:val="0070C0"/>
+          <w:lang w:val="en-US"/>
+        </w:rPr>
+        <w:t>product_id</w:t>
+      </w:r>
+      <w:proofErr w:type="spellEnd"/>
+      <w:r>
+        <w:rPr>
+          <w:color w:val="0070C0"/>
+          <w:lang w:val="en-US"/>
+        </w:rPr>
+        <w:t xml:space="preserve"> = 101</w:t>
+      </w:r>
+    </w:p>
+    <w:p>
+      <w:pPr>
+        <w:rPr>
+          <w:color w:val="0070C0"/>
+          <w:lang w:val="en-US"/>
+        </w:rPr>
+      </w:pPr>
+      <w:r>
+        <w:rPr>
+          <w:color w:val="0070C0"/>
+          <w:lang w:val="en-US"/>
+        </w:rPr>
+        <w:t>FOR UPDATE;</w:t>
+      </w:r>
+    </w:p>
+    <w:p>
+      <w:pPr>
+        <w:rPr>
+          <w:color w:val="0070C0"/>
+          <w:lang w:val="en-US"/>
+        </w:rPr>
+      </w:pPr>
+    </w:p>
+    <w:p>
+      <w:pPr>
+        <w:rPr>
+          <w:color w:val="0070C0"/>
+          <w:lang w:val="en-US"/>
+        </w:rPr>
+      </w:pPr>
+      <w:r>
+        <w:rPr>
+          <w:color w:val="0070C0"/>
+          <w:lang w:val="en-US"/>
+        </w:rPr>
+        <w:t>-- Application checks: if stock &gt; 0</w:t>
+      </w:r>
+    </w:p>
+    <w:p>
+      <w:pPr>
+        <w:rPr>
+          <w:color w:val="0070C0"/>
+          <w:lang w:val="en-US"/>
+        </w:rPr>
+      </w:pPr>
+      <w:r>
+        <w:rPr>
+          <w:color w:val="0070C0"/>
+          <w:lang w:val="en-US"/>
+        </w:rPr>
+        <w:lastRenderedPageBreak/>
+        <w:t>UPDATE inventory</w:t>
+      </w:r>
+    </w:p>
+    <w:p>
+      <w:pPr>
+        <w:rPr>
+          <w:color w:val="0070C0"/>
+          <w:lang w:val="en-US"/>
+        </w:rPr>
+      </w:pPr>
+      <w:r>
+        <w:rPr>
+          <w:color w:val="0070C0"/>
+          <w:lang w:val="en-US"/>
+        </w:rPr>
+        <w:t>SET stock = stock - 1</w:t>
+      </w:r>
+    </w:p>
+    <w:p>
+      <w:pPr>
+        <w:rPr>
+          <w:color w:val="0070C0"/>
+          <w:lang w:val="en-US"/>
+        </w:rPr>
+      </w:pPr>
+      <w:r>
+        <w:rPr>
+          <w:color w:val="0070C0"/>
+          <w:lang w:val="en-US"/>
+        </w:rPr>
+        <w:t xml:space="preserve">WHERE </w:t>
+      </w:r>
+      <w:proofErr w:type="spellStart"/>
+      <w:r>
+        <w:rPr>
+          <w:color w:val="0070C0"/>
+          <w:lang w:val="en-US"/>
+        </w:rPr>
+        <w:t>product_id</w:t>
+      </w:r>
+      <w:proofErr w:type="spellEnd"/>
+      <w:r>
+        <w:rPr>
+          <w:color w:val="0070C0"/>
+          <w:lang w:val="en-US"/>
+        </w:rPr>
+        <w:t xml:space="preserve"> = 101;</w:t>
+      </w:r>
+    </w:p>
+    <w:p>
+      <w:pPr>
+        <w:rPr>
+          <w:color w:val="0070C0"/>
+          <w:lang w:val="en-US"/>
+        </w:rPr>
+      </w:pPr>
+    </w:p>
+    <w:p>
+      <w:pPr>
+        <w:rPr>
+          <w:color w:val="0070C0"/>
+          <w:lang w:val="en-US"/>
+        </w:rPr>
+      </w:pPr>
+      <w:r>
+        <w:rPr>
+          <w:color w:val="0070C0"/>
+          <w:lang w:val="en-US"/>
+        </w:rPr>
+        <w:t>COMMIT;</w:t>
+      </w:r>
+    </w:p>
+    <w:p>
+      <w:pPr>
+        <w:rPr>
+          <w:lang w:val="en-US"/>
+        </w:rPr>
+      </w:pPr>
+    </w:p>
+    <w:p>
+      <w:pPr>
+        <w:rPr>
+          <w:lang w:val="en-US"/>
+        </w:rPr>
+      </w:pPr>
+      <w:r>
+        <w:t xml:space="preserve">FOR UPDATE tells the </w:t>
+      </w:r>
+      <w:proofErr w:type="gramStart"/>
+      <w:r>
+        <w:t>database</w:t>
+      </w:r>
+      <w:r>
+        <w:t xml:space="preserve"> ,</w:t>
+      </w:r>
+      <w:proofErr w:type="gramEnd"/>
+      <w:r>
+        <w:t xml:space="preserve"> </w:t>
+      </w:r>
+      <w:proofErr w:type="gramStart"/>
+      <w:r>
+        <w:t>Lock</w:t>
+      </w:r>
+      <w:proofErr w:type="gramEnd"/>
+      <w:r>
+        <w:t xml:space="preserve"> this row because I am going to update it.</w:t>
+      </w:r>
+    </w:p>
+    <w:p>
+      <w:pPr>
+        <w:rPr>
+          <w:lang w:val="en-US"/>
+        </w:rPr>
+      </w:pPr>
+      <w:r>
+        <w:rPr>
+          <w:lang w:val="en-US"/>
+        </w:rPr>
+        <w:drawing>
+          <wp:inline distT="0" distB="0" distL="0" distR="0" wp14:anchorId="576EF335" wp14:editId="187A743E">
+            <wp:extent cx="5731510" cy="2829560"/>
+            <wp:effectExtent l="0" t="0" r="2540" b="8890"/>
+            <wp:docPr id="784424772" name="Picture 1"/>
+            <wp:cNvGraphicFramePr>
+              <a:graphicFrameLocks xmlns:a="http://schemas.openxmlformats.org/drawingml/2006/main" noChangeAspect="1"/>
+            </wp:cNvGraphicFramePr>
+            <a:graphic xmlns:a="http://schemas.openxmlformats.org/drawingml/2006/main">
+              <a:graphicData uri="http://schemas.openxmlformats.org/drawingml/2006/picture">
+                <pic:pic xmlns:pic="http://schemas.openxmlformats.org/drawingml/2006/picture">
+                  <pic:nvPicPr>
+                    <pic:cNvPr id="784424772" name=""/>
+                    <pic:cNvPicPr/>
+                  </pic:nvPicPr>
+                  <pic:blipFill>
+                    <a:blip r:embed="rId12"/>
+                    <a:stretch>
+                      <a:fillRect/>
+                    </a:stretch>
+                  </pic:blipFill>
+                  <pic:spPr>
+                    <a:xfrm>
+                      <a:off x="0" y="0"/>
+                      <a:ext cx="5731510" cy="2829560"/>
+                    </a:xfrm>
+                    <a:prstGeom prst="rect">
+                      <a:avLst/>
+                    </a:prstGeom>
+                  </pic:spPr>
+                </pic:pic>
+              </a:graphicData>
+            </a:graphic>
+          </wp:inline>
+        </w:drawing>
+      </w:r>
+    </w:p>
+    <w:p>
+      <w:pPr>
+        <w:tabs>
+          <w:tab w:val="left" w:pos="1040"/>
+        </w:tabs>
+        <w:rPr>
+          <w:lang w:val="en-US"/>
+        </w:rPr>
+      </w:pPr>
+    </w:p>
+    <w:p>
+      <w:pPr>
+        <w:tabs>
+          <w:tab w:val="left" w:pos="1040"/>
+        </w:tabs>
+        <w:rPr>
+          <w:lang w:val="en-US"/>
+        </w:rPr>
+      </w:pPr>
+      <w:r>
+        <w:rPr>
+          <w:lang w:val="en-US"/>
+        </w:rPr>
+        <w:lastRenderedPageBreak/>
+        <w:drawing>
+          <wp:inline distT="0" distB="0" distL="0" distR="0" wp14:anchorId="309D3444" wp14:editId="654A1FD1">
+            <wp:extent cx="5731510" cy="3667125"/>
+            <wp:effectExtent l="0" t="0" r="2540" b="9525"/>
+            <wp:docPr id="641308205" name="Picture 1"/>
+            <wp:cNvGraphicFramePr>
+              <a:graphicFrameLocks xmlns:a="http://schemas.openxmlformats.org/drawingml/2006/main" noChangeAspect="1"/>
+            </wp:cNvGraphicFramePr>
+            <a:graphic xmlns:a="http://schemas.openxmlformats.org/drawingml/2006/main">
+              <a:graphicData uri="http://schemas.openxmlformats.org/drawingml/2006/picture">
+                <pic:pic xmlns:pic="http://schemas.openxmlformats.org/drawingml/2006/picture">
+                  <pic:nvPicPr>
+                    <pic:cNvPr id="641308205" name=""/>
+                    <pic:cNvPicPr/>
+                  </pic:nvPicPr>
+                  <pic:blipFill>
+                    <a:blip r:embed="rId13"/>
+                    <a:stretch>
+                      <a:fillRect/>
+                    </a:stretch>
+                  </pic:blipFill>
+                  <pic:spPr>
+                    <a:xfrm>
+                      <a:off x="0" y="0"/>
+                      <a:ext cx="5731510" cy="3667125"/>
+                    </a:xfrm>
+                    <a:prstGeom prst="rect">
+                      <a:avLst/>
+                    </a:prstGeom>
+                  </pic:spPr>
+                </pic:pic>
+              </a:graphicData>
+            </a:graphic>
+          </wp:inline>
+        </w:drawing>
+      </w:r>
+    </w:p>
+    <w:p>
+      <w:pPr>
+        <w:tabs>
+          <w:tab w:val="left" w:pos="1040"/>
+        </w:tabs>
+        <w:rPr>
+          <w:lang w:val="en-US"/>
+        </w:rPr>
+      </w:pPr>
+    </w:p>
+    <w:p>
+      <w:pPr>
+        <w:tabs>
+          <w:tab w:val="left" w:pos="1040"/>
+        </w:tabs>
+        <w:rPr>
+          <w:b/>
+          <w:bCs/>
+          <w:lang w:val="en-US"/>
+        </w:rPr>
+      </w:pPr>
+      <w:r>
+        <w:rPr>
+          <w:b/>
+          <w:bCs/>
+          <w:lang w:val="en-US"/>
+        </w:rPr>
+        <w:t>Atomic update</w:t>
+      </w:r>
+    </w:p>
+    <w:p>
+      <w:pPr>
+        <w:tabs>
+          <w:tab w:val="left" w:pos="1040"/>
+        </w:tabs>
+      </w:pPr>
+      <w:r>
+        <w:t>Alternatively, the cleaner approach is the atomic update:</w:t>
+      </w:r>
+    </w:p>
+    <w:p>
+      <w:pPr>
+        <w:tabs>
+          <w:tab w:val="left" w:pos="1040"/>
+        </w:tabs>
+        <w:rPr>
+          <w:color w:val="0070C0"/>
+          <w:lang w:val="en-US"/>
+        </w:rPr>
+      </w:pPr>
+      <w:r>
+        <w:rPr>
+          <w:color w:val="0070C0"/>
+          <w:lang w:val="en-US"/>
+        </w:rPr>
+        <w:t>UPDATE inventory</w:t>
+      </w:r>
+    </w:p>
+    <w:p>
+      <w:pPr>
+        <w:tabs>
+          <w:tab w:val="left" w:pos="1040"/>
+        </w:tabs>
+        <w:rPr>
+          <w:color w:val="0070C0"/>
+          <w:lang w:val="en-US"/>
+        </w:rPr>
+      </w:pPr>
+      <w:r>
+        <w:rPr>
+          <w:color w:val="0070C0"/>
+          <w:lang w:val="en-US"/>
+        </w:rPr>
+        <w:t>SET stock = stock - 1</w:t>
+      </w:r>
+    </w:p>
+    <w:p>
+      <w:pPr>
+        <w:tabs>
+          <w:tab w:val="left" w:pos="1040"/>
+        </w:tabs>
+        <w:rPr>
+          <w:color w:val="0070C0"/>
+          <w:lang w:val="en-US"/>
+        </w:rPr>
+      </w:pPr>
+      <w:r>
+        <w:rPr>
+          <w:color w:val="0070C0"/>
+          <w:lang w:val="en-US"/>
+        </w:rPr>
+        <w:t xml:space="preserve">WHERE </w:t>
+      </w:r>
+      <w:proofErr w:type="spellStart"/>
+      <w:r>
+        <w:rPr>
+          <w:color w:val="0070C0"/>
+          <w:lang w:val="en-US"/>
+        </w:rPr>
+        <w:t>product_id</w:t>
+      </w:r>
+      <w:proofErr w:type="spellEnd"/>
+      <w:r>
+        <w:rPr>
+          <w:color w:val="0070C0"/>
+          <w:lang w:val="en-US"/>
+        </w:rPr>
+        <w:t xml:space="preserve"> = 101</w:t>
+      </w:r>
+    </w:p>
+    <w:p>
+      <w:pPr>
+        <w:tabs>
+          <w:tab w:val="left" w:pos="1040"/>
+        </w:tabs>
+        <w:rPr>
+          <w:color w:val="0070C0"/>
+          <w:lang w:val="en-US"/>
+        </w:rPr>
+      </w:pPr>
+      <w:r>
+        <w:rPr>
+          <w:color w:val="0070C0"/>
+          <w:lang w:val="en-US"/>
+        </w:rPr>
+        <w:t xml:space="preserve">  AND stock &gt; 0;</w:t>
+      </w:r>
+    </w:p>
+    <w:p>
+      <w:pPr>
+        <w:tabs>
+          <w:tab w:val="left" w:pos="1040"/>
+        </w:tabs>
+        <w:rPr>
+          <w:color w:val="0070C0"/>
+          <w:lang w:val="en-US"/>
+        </w:rPr>
+      </w:pPr>
+    </w:p>
+    <w:p>
+      <w:pPr>
+        <w:tabs>
+          <w:tab w:val="left" w:pos="1040"/>
+        </w:tabs>
+        <w:rPr>
+          <w:b/>
+          <w:bCs/>
+        </w:rPr>
+      </w:pPr>
+      <w:r>
+        <w:t xml:space="preserve">Then check the affected row count. </w:t>
+      </w:r>
+      <w:r>
+        <w:rPr>
+          <w:b/>
+          <w:bCs/>
+        </w:rPr>
+        <w:t>This avoids needing a separate read/check.</w:t>
+      </w:r>
+    </w:p>
+    <w:p>
+      <w:pPr>
+        <w:tabs>
+          <w:tab w:val="left" w:pos="1040"/>
+        </w:tabs>
+        <w:rPr>
+          <w:b/>
+          <w:bCs/>
+        </w:rPr>
+      </w:pPr>
+    </w:p>
+    <w:p>
+      <w:pPr>
+        <w:pStyle w:val="Heading2"/>
+      </w:pPr>
+      <w:r>
+        <w:t xml:space="preserve">Pessimistic Locking </w:t>
+      </w:r>
+    </w:p>
+    <w:p>
+      <w:pPr>
+        <w:tabs>
+          <w:tab w:val="left" w:pos="1040"/>
+        </w:tabs>
+      </w:pPr>
+      <w:r>
+        <w:t>A</w:t>
+      </w:r>
+      <w:r>
+        <w:t>ssumes conflict is highly likely. It explicitly locks the target record (or table) at the database level when reading, preventing all other transactions from reading or modifying it until the lock is released.</w:t>
+      </w:r>
+    </w:p>
+    <w:p>
+      <w:pPr>
+        <w:tabs>
+          <w:tab w:val="left" w:pos="1040"/>
+        </w:tabs>
+      </w:pPr>
+      <w:r>
+        <w:rPr>
+          <w:b/>
+          <w:bCs/>
+        </w:rPr>
+        <w:lastRenderedPageBreak/>
+        <w:t xml:space="preserve">Best Use Case: </w:t>
+      </w:r>
+      <w:r>
+        <w:t>High-write, high-concurrency environments with zero tolerance for conflict (e.g., banking transactions, stock trading, flight seat bookings).</w:t>
+      </w:r>
+    </w:p>
+    <w:p>
+      <w:pPr>
+        <w:tabs>
+          <w:tab w:val="left" w:pos="1040"/>
+        </w:tabs>
+        <w:rPr>
+          <w:b/>
+          <w:bCs/>
+        </w:rPr>
+      </w:pPr>
+      <w:proofErr w:type="gramStart"/>
+      <w:r>
+        <w:rPr>
+          <w:b/>
+          <w:bCs/>
+        </w:rPr>
+        <w:t>Example :</w:t>
+      </w:r>
+      <w:proofErr w:type="gramEnd"/>
+    </w:p>
+    <w:p>
+      <w:pPr>
+        <w:tabs>
+          <w:tab w:val="left" w:pos="1040"/>
+        </w:tabs>
+      </w:pPr>
+      <w:r>
+        <w:t>SELECT * FROM inventory</w:t>
+      </w:r>
+    </w:p>
+    <w:p>
+      <w:pPr>
+        <w:tabs>
+          <w:tab w:val="left" w:pos="1040"/>
+        </w:tabs>
+      </w:pPr>
+      <w:r>
+        <w:t xml:space="preserve">WHERE </w:t>
+      </w:r>
+      <w:proofErr w:type="spellStart"/>
+      <w:r>
+        <w:t>product_id</w:t>
+      </w:r>
+      <w:proofErr w:type="spellEnd"/>
+      <w:r>
+        <w:t xml:space="preserve"> = 101</w:t>
+      </w:r>
+    </w:p>
+    <w:p>
+      <w:pPr>
+        <w:tabs>
+          <w:tab w:val="left" w:pos="1040"/>
+        </w:tabs>
+      </w:pPr>
+      <w:r>
+        <w:t>FOR UPDATE;</w:t>
+      </w:r>
+    </w:p>
+    <w:p>
+      <w:pPr>
+        <w:pStyle w:val="Heading2"/>
+      </w:pPr>
+      <w:r>
+        <w:t>Optimistic Locking</w:t>
+      </w:r>
+    </w:p>
+    <w:p>
+      <w:pPr>
+        <w:tabs>
+          <w:tab w:val="left" w:pos="1040"/>
+        </w:tabs>
+      </w:pPr>
+      <w:r>
+        <w:t>A</w:t>
+      </w:r>
+      <w:r>
+        <w:t>ssumes conflict is rare. Instead of locking a record when reading it, it tracks a version number or timestamp. When updating, it checks if the version has changed. If another process modified the data in the meantime, the update fails or retries.</w:t>
+      </w:r>
+    </w:p>
+    <w:p>
+      <w:pPr>
+        <w:tabs>
+          <w:tab w:val="left" w:pos="1040"/>
+        </w:tabs>
+      </w:pPr>
+      <w:r>
+        <w:rPr>
+          <w:b/>
+          <w:bCs/>
+        </w:rPr>
+        <w:t>Best Use Case:</w:t>
+      </w:r>
+      <w:r>
+        <w:t xml:space="preserve"> High-read, low-write environments (e.g., e-commerce product listings, editing user profile settings).</w:t>
+      </w:r>
+    </w:p>
+    <w:p>
+      <w:pPr>
+        <w:tabs>
+          <w:tab w:val="left" w:pos="1040"/>
+        </w:tabs>
+      </w:pPr>
+    </w:p>
+    <w:p>
+      <w:pPr>
+        <w:tabs>
+          <w:tab w:val="left" w:pos="1040"/>
+        </w:tabs>
+      </w:pPr>
+      <w:r>
+        <w:t>Example:</w:t>
+      </w:r>
+      <w:r>
+        <w:t xml:space="preserve"> </w:t>
+      </w:r>
+    </w:p>
+    <w:p>
+      <w:pPr>
+        <w:tabs>
+          <w:tab w:val="left" w:pos="1040"/>
+        </w:tabs>
+      </w:pPr>
+      <w:r>
+        <w:t>UPDATE inventory</w:t>
+      </w:r>
+    </w:p>
+    <w:p>
+      <w:pPr>
+        <w:tabs>
+          <w:tab w:val="left" w:pos="1040"/>
+        </w:tabs>
+      </w:pPr>
+      <w:r>
+        <w:t>SET stock = 9, version = 6</w:t>
+      </w:r>
+    </w:p>
+    <w:p>
+      <w:pPr>
+        <w:tabs>
+          <w:tab w:val="left" w:pos="1040"/>
+        </w:tabs>
+      </w:pPr>
+      <w:r>
+        <w:t>WHERE id = 101</w:t>
+      </w:r>
+    </w:p>
+    <w:p>
+      <w:pPr>
+        <w:tabs>
+          <w:tab w:val="left" w:pos="1040"/>
+        </w:tabs>
+      </w:pPr>
+      <w:r>
+        <w:t xml:space="preserve">  AND version = 5;</w:t>
+      </w:r>
+    </w:p>
+    <w:p>
+      <w:pPr>
+        <w:tabs>
+          <w:tab w:val="left" w:pos="1040"/>
+        </w:tabs>
+      </w:pPr>
+    </w:p>
+    <w:p>
+      <w:pPr>
+        <w:tabs>
+          <w:tab w:val="left" w:pos="1040"/>
+        </w:tabs>
+      </w:pPr>
+      <w:r>
+        <w:t xml:space="preserve">If 0 rows updated → someone changed it first → </w:t>
+      </w:r>
+      <w:r>
+        <w:rPr>
+          <w:b/>
+          <w:bCs/>
+        </w:rPr>
+        <w:t>conflict</w:t>
+      </w:r>
+      <w:r>
+        <w:t xml:space="preserve"> → retry/reject.</w:t>
+      </w:r>
+    </w:p>
+    <w:p>
+      <w:pPr>
+        <w:tabs>
+          <w:tab w:val="left" w:pos="1040"/>
+        </w:tabs>
+      </w:pPr>
+    </w:p>
+    <w:p>
+      <w:pPr>
+        <w:pStyle w:val="Heading2"/>
+      </w:pPr>
+      <w:r>
+        <w:t>Idempotency with sensitive transactions</w:t>
+      </w:r>
+    </w:p>
+    <w:p>
+      <w:pPr>
+        <w:tabs>
+          <w:tab w:val="left" w:pos="1040"/>
+        </w:tabs>
+      </w:pPr>
+      <w:r>
+        <w:t xml:space="preserve">How do you achieve idempotency with sensitive transactions like credit / </w:t>
+      </w:r>
+      <w:proofErr w:type="gramStart"/>
+      <w:r>
+        <w:t>debit ?</w:t>
+      </w:r>
+      <w:proofErr w:type="gramEnd"/>
+    </w:p>
+    <w:p>
+      <w:pPr>
+        <w:tabs>
+          <w:tab w:val="left" w:pos="1040"/>
+        </w:tabs>
+      </w:pPr>
+      <w:r>
+        <w:t xml:space="preserve">For </w:t>
+      </w:r>
+      <w:r>
+        <w:rPr>
+          <w:b/>
+          <w:bCs/>
+        </w:rPr>
+        <w:t>credit/debit transactions</w:t>
+      </w:r>
+      <w:r>
+        <w:t xml:space="preserve">, achieve idempotency using an </w:t>
+      </w:r>
+      <w:r>
+        <w:rPr>
+          <w:b/>
+          <w:bCs/>
+        </w:rPr>
+        <w:t>idempotency key + database constraint + atomic transaction</w:t>
+      </w:r>
+      <w:r>
+        <w:t>.</w:t>
+      </w:r>
+    </w:p>
+    <w:p>
+      <w:pPr>
+        <w:tabs>
+          <w:tab w:val="left" w:pos="1040"/>
+        </w:tabs>
+      </w:pPr>
+    </w:p>
+    <w:p>
+      <w:pPr>
+        <w:tabs>
+          <w:tab w:val="left" w:pos="1040"/>
+        </w:tabs>
+        <w:rPr>
+          <w:b/>
+          <w:bCs/>
+        </w:rPr>
+      </w:pPr>
+      <w:r>
+        <w:rPr>
+          <w:b/>
+          <w:bCs/>
+        </w:rPr>
+        <w:lastRenderedPageBreak/>
+        <w:t xml:space="preserve">Client </w:t>
+      </w:r>
+      <w:r>
+        <w:rPr>
+          <w:b/>
+          <w:bCs/>
+        </w:rPr>
+        <w:t>sends:</w:t>
+      </w:r>
+    </w:p>
+    <w:p>
+      <w:pPr>
+        <w:tabs>
+          <w:tab w:val="left" w:pos="1040"/>
+        </w:tabs>
+      </w:pPr>
+      <w:r>
+        <w:t>POST /transfer</w:t>
+      </w:r>
+    </w:p>
+    <w:p>
+      <w:pPr>
+        <w:tabs>
+          <w:tab w:val="left" w:pos="1040"/>
+        </w:tabs>
+      </w:pPr>
+      <w:r>
+        <w:t>Idempotency-Key: TXN-12345</w:t>
+      </w:r>
+    </w:p>
+    <w:p>
+      <w:pPr>
+        <w:tabs>
+          <w:tab w:val="left" w:pos="1040"/>
+        </w:tabs>
+      </w:pPr>
+    </w:p>
+    <w:p>
+      <w:pPr>
+        <w:tabs>
+          <w:tab w:val="left" w:pos="1040"/>
+        </w:tabs>
+        <w:rPr>
+          <w:b/>
+          <w:bCs/>
+        </w:rPr>
+      </w:pPr>
+      <w:r>
+        <w:rPr>
+          <w:b/>
+          <w:bCs/>
+        </w:rPr>
+        <w:t>Store the key with the transaction:</w:t>
+      </w:r>
+    </w:p>
+    <w:p>
+      <w:pPr>
+        <w:tabs>
+          <w:tab w:val="left" w:pos="1040"/>
+        </w:tabs>
+      </w:pPr>
+      <w:proofErr w:type="spellStart"/>
+      <w:r>
+        <w:t>transaction_id</w:t>
+      </w:r>
+      <w:proofErr w:type="spellEnd"/>
+      <w:r>
+        <w:t xml:space="preserve"> | </w:t>
+      </w:r>
+      <w:proofErr w:type="spellStart"/>
+      <w:r>
+        <w:t>idempotency_key</w:t>
+      </w:r>
+      <w:proofErr w:type="spellEnd"/>
+      <w:r>
+        <w:t xml:space="preserve"> | status | amount</w:t>
+      </w:r>
+    </w:p>
+    <w:p>
+      <w:pPr>
+        <w:tabs>
+          <w:tab w:val="left" w:pos="1040"/>
+        </w:tabs>
+      </w:pPr>
+      <w:r>
+        <w:t>----------------------------------------------------</w:t>
+      </w:r>
+    </w:p>
+    <w:p>
+      <w:pPr>
+        <w:tabs>
+          <w:tab w:val="left" w:pos="1040"/>
+        </w:tabs>
+      </w:pPr>
+      <w:r>
+        <w:t>T1001          | TXN-12345       | SUCCESS| 500</w:t>
+      </w:r>
+    </w:p>
+    <w:p>
+      <w:pPr>
+        <w:tabs>
+          <w:tab w:val="left" w:pos="1040"/>
+        </w:tabs>
+      </w:pPr>
+    </w:p>
+    <w:p>
+      <w:pPr>
+        <w:tabs>
+          <w:tab w:val="left" w:pos="1040"/>
+        </w:tabs>
+      </w:pPr>
+      <w:r>
+        <w:t>Then:</w:t>
+      </w:r>
+    </w:p>
+    <w:p>
+      <w:pPr>
+        <w:numPr>
+          <w:ilvl w:val="0"/>
+          <w:numId w:val="40"/>
+        </w:numPr>
+        <w:tabs>
+          <w:tab w:val="left" w:pos="1040"/>
+        </w:tabs>
+      </w:pPr>
+      <w:r>
+        <w:rPr>
+          <w:b/>
+          <w:bCs/>
+        </w:rPr>
+        <w:t>First request</w:t>
+      </w:r>
+      <w:r>
+        <w:t xml:space="preserve"> → process debit/credit and save TXN-12345. </w:t>
+      </w:r>
+    </w:p>
+    <w:p>
+      <w:pPr>
+        <w:numPr>
+          <w:ilvl w:val="0"/>
+          <w:numId w:val="40"/>
+        </w:numPr>
+        <w:tabs>
+          <w:tab w:val="left" w:pos="1040"/>
+        </w:tabs>
+      </w:pPr>
+      <w:r>
+        <w:rPr>
+          <w:b/>
+          <w:bCs/>
+        </w:rPr>
+        <w:t>Retry with same key</w:t>
+      </w:r>
+      <w:r>
+        <w:t xml:space="preserve"> → detect existing key and </w:t>
+      </w:r>
+      <w:r>
+        <w:rPr>
+          <w:b/>
+          <w:bCs/>
+        </w:rPr>
+        <w:t>return the previous result</w:t>
+      </w:r>
+      <w:r>
+        <w:t xml:space="preserve"> without applying the debit/credit again. </w:t>
+      </w:r>
+    </w:p>
+    <w:p>
+      <w:pPr>
+        <w:numPr>
+          <w:ilvl w:val="0"/>
+          <w:numId w:val="40"/>
+        </w:numPr>
+        <w:tabs>
+          <w:tab w:val="left" w:pos="1040"/>
+        </w:tabs>
+      </w:pPr>
+      <w:r>
+        <w:t xml:space="preserve">Put a </w:t>
+      </w:r>
+      <w:r>
+        <w:rPr>
+          <w:b/>
+          <w:bCs/>
+        </w:rPr>
+        <w:t>UNIQUE constraint</w:t>
+      </w:r>
+      <w:r>
+        <w:t xml:space="preserve"> on </w:t>
+      </w:r>
+      <w:proofErr w:type="spellStart"/>
+      <w:r>
+        <w:t>idempotency_key</w:t>
+      </w:r>
+      <w:proofErr w:type="spellEnd"/>
+      <w:r>
+        <w:t xml:space="preserve"> so concurrent duplicate requests cannot both process it. </w:t>
+      </w:r>
+    </w:p>
+    <w:p>
+      <w:pPr>
+        <w:numPr>
+          <w:ilvl w:val="0"/>
+          <w:numId w:val="40"/>
+        </w:numPr>
+        <w:tabs>
+          <w:tab w:val="left" w:pos="1040"/>
+        </w:tabs>
+      </w:pPr>
+      <w:r>
+        <w:t xml:space="preserve">Perform </w:t>
+      </w:r>
+      <w:r>
+        <w:rPr>
+          <w:b/>
+          <w:bCs/>
+        </w:rPr>
+        <w:t>balance update + transaction record + idempotency record in one DB transaction</w:t>
+      </w:r>
+      <w:r>
+        <w:t>.</w:t>
+      </w:r>
+    </w:p>
+    <w:p>
+      <w:pPr>
+        <w:tabs>
+          <w:tab w:val="left" w:pos="1040"/>
+        </w:tabs>
+      </w:pPr>
     </w:p>
     <w:sectPr>
       <w:pgSz w:w="11906" w:h="16838"/>
@@ -17571,7 +20331,7 @@
 </file>
 
 <file path=word/numbering.xml><?xml version="1.0" encoding="utf-8"?>
-<w:numbering xmlns:wpc="http://schemas.microsoft.com/office/word/2010/wordprocessingCanvas" xmlns:cx="http://schemas.microsoft.com/office/drawing/2014/chartex" xmlns:cx1="http://schemas.microsoft.com/office/drawing/2015/9/8/chartex" xmlns:cx2="http://schemas.microsoft.com/office/drawing/2015/10/21/chartex" xmlns:cx3="http://schemas.microsoft.com/office/drawing/2016/5/9/chartex" xmlns:cx4="http://schemas.microsoft.com/office/drawing/2016/5/10/chartex" xmlns:cx5="http://schemas.microsoft.com/office/drawing/2016/5/11/chartex" xmlns:cx6="http://schemas.microsoft.com/office/drawing/2016/5/12/chartex" xmlns:cx7="http://schemas.microsoft.com/office/drawing/2016/5/13/chartex" xmlns:cx8="http://schemas.microsoft.com/office/drawing/2016/5/14/chartex" xmlns:mc="http://schemas.openxmlformats.org/markup-compatibility/2006" xmlns:aink="http://schemas.microsoft.com/office/drawing/2016/ink" xmlns:am3d="http://schemas.microsoft.com/office/drawing/2017/model3d" xmlns:o="urn:schemas-microsoft-com:office:office" xmlns:oel="http://schemas.microsoft.com/office/2019/extlst" xmlns:r="http://schemas.openxmlformats.org/officeDocument/2006/relationships" xmlns:m="http://schemas.openxmlformats.org/officeDocument/2006/math" xmlns:v="urn:schemas-microsoft-com:vml" xmlns:wp14="http://schemas.microsoft.com/office/word/2010/wordprocessingDrawing" xmlns:wp="http://schemas.openxmlformats.org/drawingml/2006/wordprocessingDrawing" xmlns:w10="urn:schemas-microsoft-com:office:word" xmlns:w="http://schemas.openxmlformats.org/wordprocessingml/2006/main" xmlns:w14="http://schemas.microsoft.com/office/word/2010/wordml" xmlns:w15="http://schemas.microsoft.com/office/word/2012/wordml" xmlns:w16cei="http://schemas.microsoft.com/office/word/2026/wordml/cei" xmlns:w16cex="http://schemas.microsoft.com/office/word/2018/wordml/cex" xmlns:w16cid="http://schemas.microsoft.com/office/word/2016/wordml/cid" xmlns:w16="http://schemas.microsoft.com/office/word/2018/wordml" xmlns:w16du="http://schemas.microsoft.com/office/word/2023/wordml/word16du" xmlns:w16sdtdh="http://schemas.microsoft.com/office/word/2020/wordml/sdtdatahash" xmlns:w16sdtfl="http://schemas.microsoft.com/office/word/2024/wordml/sdtformatlock" xmlns:w16se="http://schemas.microsoft.com/office/word/2015/wordml/symex" xmlns:wpg="http://schemas.microsoft.com/office/word/2010/wordprocessingGroup" xmlns:wpi="http://schemas.microsoft.com/office/word/2010/wordprocessingInk" xmlns:wne="http://schemas.microsoft.com/office/word/2006/wordml" xmlns:wps="http://schemas.microsoft.com/office/word/2010/wordprocessingShape" mc:Ignorable="w14 w15 w16se w16cid w16 w16cex w16sdtdh w16sdtfl w16du wp14">
+<w:numbering xmlns:wpc="http://schemas.microsoft.com/office/word/2010/wordprocessingCanvas" xmlns:cx="http://schemas.microsoft.com/office/drawing/2014/chartex" xmlns:cx1="http://schemas.microsoft.com/office/drawing/2015/9/8/chartex" xmlns:cx2="http://schemas.microsoft.com/office/drawing/2015/10/21/chartex" xmlns:cx3="http://schemas.microsoft.com/office/drawing/2016/5/9/chartex" xmlns:cx4="http://schemas.microsoft.com/office/drawing/2016/5/10/chartex" xmlns:cx5="http://schemas.microsoft.com/office/drawing/2016/5/11/chartex" xmlns:cx6="http://schemas.microsoft.com/office/drawing/2016/5/12/chartex" xmlns:cx7="http://schemas.microsoft.com/office/drawing/2016/5/13/chartex" xmlns:cx8="http://schemas.microsoft.com/office/drawing/2016/5/14/chartex" xmlns:mc="http://schemas.openxmlformats.org/markup-compatibility/2006" xmlns:aink="http://schemas.microsoft.com/office/drawing/2016/ink" xmlns:am3d="http://schemas.microsoft.com/office/drawing/2017/model3d" xmlns:o="urn:schemas-microsoft-com:office:office" xmlns:oel="http://schemas.microsoft.com/office/2019/extlst" xmlns:r="http://schemas.openxmlformats.org/officeDocument/2006/relationships" xmlns:m="http://schemas.openxmlformats.org/officeDocument/2006/math" xmlns:v="urn:schemas-microsoft-com:vml" xmlns:wp14="http://schemas.microsoft.com/office/word/2010/wordprocessingDrawing" xmlns:wp="http://schemas.openxmlformats.org/drawingml/2006/wordprocessingDrawing" xmlns:w10="urn:schemas-microsoft-com:office:word" xmlns:w="http://schemas.openxmlformats.org/wordprocessingml/2006/main" xmlns:w14="http://schemas.microsoft.com/office/word/2010/wordml" xmlns:w15="http://schemas.microsoft.com/office/word/2012/wordml" xmlns:w16cex="http://schemas.microsoft.com/office/word/2018/wordml/cex" xmlns:w16cid="http://schemas.microsoft.com/office/word/2016/wordml/cid" xmlns:w16="http://schemas.microsoft.com/office/word/2018/wordml" xmlns:w16du="http://schemas.microsoft.com/office/word/2023/wordml/word16du" xmlns:w16sdtdh="http://schemas.microsoft.com/office/word/2020/wordml/sdtdatahash" xmlns:w16sdtfl="http://schemas.microsoft.com/office/word/2024/wordml/sdtformatlock" xmlns:w16se="http://schemas.microsoft.com/office/word/2015/wordml/symex" xmlns:wpg="http://schemas.microsoft.com/office/word/2010/wordprocessingGroup" xmlns:wpi="http://schemas.microsoft.com/office/word/2010/wordprocessingInk" xmlns:wne="http://schemas.microsoft.com/office/word/2006/wordml" xmlns:wps="http://schemas.microsoft.com/office/word/2010/wordprocessingShape" mc:Ignorable="w14 w15 w16se w16cid w16 w16cex w16sdtdh w16sdtfl w16du wp14">
   <w:abstractNum w:abstractNumId="0" w15:restartNumberingAfterBreak="0">
     <w:nsid w:val="016B0C1A"/>
     <w:multiLevelType w:val="multilevel"/>
@@ -21977,6 +24737,119 @@
     </w:lvl>
   </w:abstractNum>
   <w:abstractNum w:abstractNumId="30" w15:restartNumberingAfterBreak="0">
+    <w:nsid w:val="66547A8F"/>
+    <w:multiLevelType w:val="multilevel"/>
+    <w:tmpl w:val="0F44133A"/>
+    <w:lvl w:ilvl="0">
+      <w:start w:val="1"/>
+      <w:numFmt w:val="decimal"/>
+      <w:lvlText w:val="%1."/>
+      <w:lvlJc w:val="left"/>
+      <w:pPr>
+        <w:tabs>
+          <w:tab w:val="num" w:pos="720"/>
+        </w:tabs>
+        <w:ind w:left="720" w:hanging="360"/>
+      </w:pPr>
+    </w:lvl>
+    <w:lvl w:ilvl="1" w:tentative="1">
+      <w:start w:val="1"/>
+      <w:numFmt w:val="decimal"/>
+      <w:lvlText w:val="%2."/>
+      <w:lvlJc w:val="left"/>
+      <w:pPr>
+        <w:tabs>
+          <w:tab w:val="num" w:pos="1440"/>
+        </w:tabs>
+        <w:ind w:left="1440" w:hanging="360"/>
+      </w:pPr>
+    </w:lvl>
+    <w:lvl w:ilvl="2" w:tentative="1">
+      <w:start w:val="1"/>
+      <w:numFmt w:val="decimal"/>
+      <w:lvlText w:val="%3."/>
+      <w:lvlJc w:val="left"/>
+      <w:pPr>
+        <w:tabs>
+          <w:tab w:val="num" w:pos="2160"/>
+        </w:tabs>
+        <w:ind w:left="2160" w:hanging="360"/>
+      </w:pPr>
+    </w:lvl>
+    <w:lvl w:ilvl="3" w:tentative="1">
+      <w:start w:val="1"/>
+      <w:numFmt w:val="decimal"/>
+      <w:lvlText w:val="%4."/>
+      <w:lvlJc w:val="left"/>
+      <w:pPr>
+        <w:tabs>
+          <w:tab w:val="num" w:pos="2880"/>
+        </w:tabs>
+        <w:ind w:left="2880" w:hanging="360"/>
+      </w:pPr>
+    </w:lvl>
+    <w:lvl w:ilvl="4" w:tentative="1">
+      <w:start w:val="1"/>
+      <w:numFmt w:val="decimal"/>
+      <w:lvlText w:val="%5."/>
+      <w:lvlJc w:val="left"/>
+      <w:pPr>
+        <w:tabs>
+          <w:tab w:val="num" w:pos="3600"/>
+        </w:tabs>
+        <w:ind w:left="3600" w:hanging="360"/>
+      </w:pPr>
+    </w:lvl>
+    <w:lvl w:ilvl="5" w:tentative="1">
+      <w:start w:val="1"/>
+      <w:numFmt w:val="decimal"/>
+      <w:lvlText w:val="%6."/>
+      <w:lvlJc w:val="left"/>
+      <w:pPr>
+        <w:tabs>
+          <w:tab w:val="num" w:pos="4320"/>
+        </w:tabs>
+        <w:ind w:left="4320" w:hanging="360"/>
+      </w:pPr>
+    </w:lvl>
+    <w:lvl w:ilvl="6" w:tentative="1">
+      <w:start w:val="1"/>
+      <w:numFmt w:val="decimal"/>
+      <w:lvlText w:val="%7."/>
+      <w:lvlJc w:val="left"/>
+      <w:pPr>
+        <w:tabs>
+          <w:tab w:val="num" w:pos="5040"/>
+        </w:tabs>
+        <w:ind w:left="5040" w:hanging="360"/>
+      </w:pPr>
+    </w:lvl>
+    <w:lvl w:ilvl="7" w:tentative="1">
+      <w:start w:val="1"/>
+      <w:numFmt w:val="decimal"/>
+      <w:lvlText w:val="%8."/>
+      <w:lvlJc w:val="left"/>
+      <w:pPr>
+        <w:tabs>
+          <w:tab w:val="num" w:pos="5760"/>
+        </w:tabs>
+        <w:ind w:left="5760" w:hanging="360"/>
+      </w:pPr>
+    </w:lvl>
+    <w:lvl w:ilvl="8" w:tentative="1">
+      <w:start w:val="1"/>
+      <w:numFmt w:val="decimal"/>
+      <w:lvlText w:val="%9."/>
+      <w:lvlJc w:val="left"/>
+      <w:pPr>
+        <w:tabs>
+          <w:tab w:val="num" w:pos="6480"/>
+        </w:tabs>
+        <w:ind w:left="6480" w:hanging="360"/>
+      </w:pPr>
+    </w:lvl>
+  </w:abstractNum>
+  <w:abstractNum w:abstractNumId="31" w15:restartNumberingAfterBreak="0">
     <w:nsid w:val="67DF35D1"/>
     <w:multiLevelType w:val="multilevel"/>
     <w:tmpl w:val="B2B2DCC4"/>
@@ -22125,7 +24998,7 @@
       </w:rPr>
     </w:lvl>
   </w:abstractNum>
-  <w:abstractNum w:abstractNumId="31" w15:restartNumberingAfterBreak="0">
+  <w:abstractNum w:abstractNumId="32" w15:restartNumberingAfterBreak="0">
     <w:nsid w:val="68990506"/>
     <w:multiLevelType w:val="multilevel"/>
     <w:tmpl w:val="C5EED61C"/>
@@ -22274,7 +25147,7 @@
       </w:rPr>
     </w:lvl>
   </w:abstractNum>
-  <w:abstractNum w:abstractNumId="32" w15:restartNumberingAfterBreak="0">
+  <w:abstractNum w:abstractNumId="33" w15:restartNumberingAfterBreak="0">
     <w:nsid w:val="6BB12CDC"/>
     <w:multiLevelType w:val="multilevel"/>
     <w:tmpl w:val="7A2C8D36"/>
@@ -22423,7 +25296,7 @@
       </w:rPr>
     </w:lvl>
   </w:abstractNum>
-  <w:abstractNum w:abstractNumId="33" w15:restartNumberingAfterBreak="0">
+  <w:abstractNum w:abstractNumId="34" w15:restartNumberingAfterBreak="0">
     <w:nsid w:val="6E2550D4"/>
     <w:multiLevelType w:val="multilevel"/>
     <w:tmpl w:val="20D4E98E"/>
@@ -22572,7 +25445,7 @@
       </w:rPr>
     </w:lvl>
   </w:abstractNum>
-  <w:abstractNum w:abstractNumId="34" w15:restartNumberingAfterBreak="0">
+  <w:abstractNum w:abstractNumId="35" w15:restartNumberingAfterBreak="0">
     <w:nsid w:val="6E5E52B3"/>
     <w:multiLevelType w:val="multilevel"/>
     <w:tmpl w:val="CFA81EC2"/>
@@ -22721,7 +25594,7 @@
       </w:rPr>
     </w:lvl>
   </w:abstractNum>
-  <w:abstractNum w:abstractNumId="35" w15:restartNumberingAfterBreak="0">
+  <w:abstractNum w:abstractNumId="36" w15:restartNumberingAfterBreak="0">
     <w:nsid w:val="755B045E"/>
     <w:multiLevelType w:val="multilevel"/>
     <w:tmpl w:val="7EDC5D8C"/>
@@ -22870,7 +25743,7 @@
       </w:rPr>
     </w:lvl>
   </w:abstractNum>
-  <w:abstractNum w:abstractNumId="36" w15:restartNumberingAfterBreak="0">
+  <w:abstractNum w:abstractNumId="37" w15:restartNumberingAfterBreak="0">
     <w:nsid w:val="75801322"/>
     <w:multiLevelType w:val="hybridMultilevel"/>
     <w:tmpl w:val="6FF6C19C"/>
@@ -22983,7 +25856,7 @@
       </w:rPr>
     </w:lvl>
   </w:abstractNum>
-  <w:abstractNum w:abstractNumId="37" w15:restartNumberingAfterBreak="0">
+  <w:abstractNum w:abstractNumId="38" w15:restartNumberingAfterBreak="0">
     <w:nsid w:val="7D4F1DEC"/>
     <w:multiLevelType w:val="multilevel"/>
     <w:tmpl w:val="221612A8"/>
@@ -23132,7 +26005,7 @@
       </w:rPr>
     </w:lvl>
   </w:abstractNum>
-  <w:abstractNum w:abstractNumId="38" w15:restartNumberingAfterBreak="0">
+  <w:abstractNum w:abstractNumId="39" w15:restartNumberingAfterBreak="0">
     <w:nsid w:val="7E9449BB"/>
     <w:multiLevelType w:val="multilevel"/>
     <w:tmpl w:val="B97C780A"/>
@@ -23294,10 +26167,10 @@
     <w:abstractNumId w:val="20"/>
   </w:num>
   <w:num w:numId="5" w16cid:durableId="1165361861">
-    <w:abstractNumId w:val="31"/>
+    <w:abstractNumId w:val="32"/>
   </w:num>
   <w:num w:numId="6" w16cid:durableId="708996701">
-    <w:abstractNumId w:val="35"/>
+    <w:abstractNumId w:val="36"/>
   </w:num>
   <w:num w:numId="7" w16cid:durableId="518351629">
     <w:abstractNumId w:val="16"/>
@@ -23309,7 +26182,7 @@
     <w:abstractNumId w:val="2"/>
   </w:num>
   <w:num w:numId="10" w16cid:durableId="694887523">
-    <w:abstractNumId w:val="34"/>
+    <w:abstractNumId w:val="35"/>
   </w:num>
   <w:num w:numId="11" w16cid:durableId="615676618">
     <w:abstractNumId w:val="21"/>
@@ -23351,13 +26224,13 @@
     <w:abstractNumId w:val="14"/>
   </w:num>
   <w:num w:numId="24" w16cid:durableId="2084252132">
-    <w:abstractNumId w:val="37"/>
+    <w:abstractNumId w:val="38"/>
   </w:num>
   <w:num w:numId="25" w16cid:durableId="1218665684">
     <w:abstractNumId w:val="25"/>
   </w:num>
   <w:num w:numId="26" w16cid:durableId="1634170077">
-    <w:abstractNumId w:val="32"/>
+    <w:abstractNumId w:val="33"/>
   </w:num>
   <w:num w:numId="27" w16cid:durableId="2108572996">
     <w:abstractNumId w:val="18"/>
@@ -23366,13 +26239,13 @@
     <w:abstractNumId w:val="0"/>
   </w:num>
   <w:num w:numId="29" w16cid:durableId="1018888655">
-    <w:abstractNumId w:val="33"/>
+    <w:abstractNumId w:val="34"/>
   </w:num>
   <w:num w:numId="30" w16cid:durableId="417218474">
     <w:abstractNumId w:val="17"/>
   </w:num>
   <w:num w:numId="31" w16cid:durableId="772552376">
-    <w:abstractNumId w:val="36"/>
+    <w:abstractNumId w:val="37"/>
   </w:num>
   <w:num w:numId="32" w16cid:durableId="1843549269">
     <w:abstractNumId w:val="26"/>
@@ -23381,7 +26254,7 @@
     </w:lvlOverride>
   </w:num>
   <w:num w:numId="33" w16cid:durableId="119497548">
-    <w:abstractNumId w:val="30"/>
+    <w:abstractNumId w:val="31"/>
   </w:num>
   <w:num w:numId="34" w16cid:durableId="1303735537">
     <w:abstractNumId w:val="8"/>
@@ -23390,7 +26263,7 @@
     <w:abstractNumId w:val="29"/>
   </w:num>
   <w:num w:numId="36" w16cid:durableId="1239906544">
-    <w:abstractNumId w:val="38"/>
+    <w:abstractNumId w:val="39"/>
   </w:num>
   <w:num w:numId="37" w16cid:durableId="199172225">
     <w:abstractNumId w:val="19"/>
@@ -23400,6 +26273,9 @@
   </w:num>
   <w:num w:numId="39" w16cid:durableId="395978104">
     <w:abstractNumId w:val="3"/>
+  </w:num>
+  <w:num w:numId="40" w16cid:durableId="1953977678">
+    <w:abstractNumId w:val="30"/>
   </w:num>
   <w:numIdMacAtCleanup w:val="29"/>
 </w:numbering>

</xml_diff>